<commit_message>
Deterministic jury: exact and score intervals, simulation study, binom_cdf overflow fix
</commit_message>
<xml_diff>
--- a/docs/GRAIL_weekly_progress.docx
+++ b/docs/GRAIL_weekly_progress.docx
@@ -350,7 +350,7 @@
                 <w:sz w:val="18"/>
                 <w:szCs w:val="18"/>
               </w:rPr>
-              <w:t xml:space="preserve">183 tests · FIRST SIGNIFICANT FINDING</w:t>
+              <w:t xml:space="preserve">184 tests · finding banked on GitHub</w:t>
             </w:r>
           </w:p>
         </w:tc>
@@ -375,7 +375,7 @@
                 <w:sz w:val="18"/>
                 <w:szCs w:val="18"/>
               </w:rPr>
-              <w:t xml:space="preserve">Second model + template variation</w:t>
+              <w:t xml:space="preserve">Second model + deterministic jury</w:t>
             </w:r>
           </w:p>
         </w:tc>
@@ -8855,7 +8855,7 @@
           <w:sz w:val="20"/>
           <w:szCs w:val="20"/>
         </w:rPr>
-        <w:t xml:space="preserve">Actions, in dependency order</w:t>
+        <w:t xml:space="preserve">Actions — status at 18 August</w:t>
       </w:r>
     </w:p>
     <w:tbl>
@@ -8872,8 +8872,9 @@
       </w:tblPr>
       <w:tblGrid>
         <w:gridCol w:w="620"/>
-        <w:gridCol w:w="4300"/>
-        <w:gridCol w:w="4100"/>
+        <w:gridCol w:w="3700"/>
+        <w:gridCol w:w="1500"/>
+        <w:gridCol w:w="3200"/>
       </w:tblGrid>
       <w:tr>
         <w:trPr>
@@ -8909,7 +8910,7 @@
         </w:tc>
         <w:tc>
           <w:tcPr>
-            <w:tcW w:type="dxa" w:w="4300"/>
+            <w:tcW w:type="dxa" w:w="3700"/>
             <w:shd w:fill="EEF1F4" w:color="auto" w:val="clear"/>
             <w:tcMar>
               <w:top w:type="dxa" w:w="80"/>
@@ -8937,7 +8938,7 @@
         </w:tc>
         <w:tc>
           <w:tcPr>
-            <w:tcW w:type="dxa" w:w="4100"/>
+            <w:tcW w:type="dxa" w:w="1500"/>
             <w:shd w:fill="EEF1F4" w:color="auto" w:val="clear"/>
             <w:tcMar>
               <w:top w:type="dxa" w:w="80"/>
@@ -8959,7 +8960,35 @@
                 <w:sz w:val="18"/>
                 <w:szCs w:val="18"/>
               </w:rPr>
-              <w:t xml:space="preserve">Why it is ordered here</w:t>
+              <w:t xml:space="preserve">Status</w:t>
+            </w:r>
+          </w:p>
+        </w:tc>
+        <w:tc>
+          <w:tcPr>
+            <w:tcW w:type="dxa" w:w="3200"/>
+            <w:shd w:fill="EEF1F4" w:color="auto" w:val="clear"/>
+            <w:tcMar>
+              <w:top w:type="dxa" w:w="80"/>
+              <w:left w:type="dxa" w:w="115"/>
+              <w:bottom w:type="dxa" w:w="80"/>
+              <w:right w:type="dxa" w:w="115"/>
+            </w:tcMar>
+          </w:tcPr>
+          <w:p>
+            <w:pPr>
+              <w:spacing w:after="0" w:line="252"/>
+            </w:pPr>
+            <w:r>
+              <w:rPr>
+                <w:rFonts w:ascii="Calibri" w:cs="Calibri" w:eastAsia="Calibri" w:hAnsi="Calibri"/>
+                <w:b/>
+                <w:bCs/>
+                <w:color w:val="1A1A1A"/>
+                <w:sz w:val="18"/>
+                <w:szCs w:val="18"/>
+              </w:rPr>
+              <w:t xml:space="preserve">Note</w:t>
             </w:r>
           </w:p>
         </w:tc>
@@ -8992,51 +9021,79 @@
         </w:tc>
         <w:tc>
           <w:tcPr>
-            <w:tcW w:type="dxa" w:w="4300"/>
-            <w:tcMar>
-              <w:top w:type="dxa" w:w="80"/>
-              <w:left w:type="dxa" w:w="115"/>
-              <w:bottom w:type="dxa" w:w="80"/>
-              <w:right w:type="dxa" w:w="115"/>
-            </w:tcMar>
-          </w:tcPr>
-          <w:p>
-            <w:pPr>
-              <w:spacing w:after="0" w:line="252"/>
-            </w:pPr>
-            <w:r>
-              <w:rPr>
-                <w:rFonts w:ascii="Calibri" w:cs="Calibri" w:eastAsia="Calibri" w:hAnsi="Calibri"/>
-                <w:color w:val="1A1A1A"/>
-                <w:sz w:val="18"/>
-                <w:szCs w:val="18"/>
-              </w:rPr>
-              <w:t xml:space="preserve">Build the deterministic jury; reproduce the finding through it</w:t>
-            </w:r>
-          </w:p>
-        </w:tc>
-        <w:tc>
-          <w:tcPr>
-            <w:tcW w:type="dxa" w:w="4100"/>
-            <w:tcMar>
-              <w:top w:type="dxa" w:w="80"/>
-              <w:left w:type="dxa" w:w="115"/>
-              <w:bottom w:type="dxa" w:w="80"/>
-              <w:right w:type="dxa" w:w="115"/>
-            </w:tcMar>
-          </w:tcPr>
-          <w:p>
-            <w:pPr>
-              <w:spacing w:after="0" w:line="252"/>
-            </w:pPr>
-            <w:r>
-              <w:rPr>
-                <w:rFonts w:ascii="Calibri" w:cs="Calibri" w:eastAsia="Calibri" w:hAnsi="Calibri"/>
-                <w:color w:val="9B2C2C"/>
-                <w:sz w:val="18"/>
-                <w:szCs w:val="18"/>
-              </w:rPr>
-              <w:t xml:space="preserve">The number must come from audited code, not an analysis cell</w:t>
+            <w:tcW w:type="dxa" w:w="3700"/>
+            <w:tcMar>
+              <w:top w:type="dxa" w:w="80"/>
+              <w:left w:type="dxa" w:w="115"/>
+              <w:bottom w:type="dxa" w:w="80"/>
+              <w:right w:type="dxa" w:w="115"/>
+            </w:tcMar>
+          </w:tcPr>
+          <w:p>
+            <w:pPr>
+              <w:spacing w:after="0" w:line="252"/>
+            </w:pPr>
+            <w:r>
+              <w:rPr>
+                <w:rFonts w:ascii="Calibri" w:cs="Calibri" w:eastAsia="Calibri" w:hAnsi="Calibri"/>
+                <w:color w:val="1A1A1A"/>
+                <w:sz w:val="18"/>
+                <w:szCs w:val="18"/>
+              </w:rPr>
+              <w:t xml:space="preserve">Bank the finding — full corrected run committed and pushed</w:t>
+            </w:r>
+          </w:p>
+        </w:tc>
+        <w:tc>
+          <w:tcPr>
+            <w:tcW w:type="dxa" w:w="1500"/>
+            <w:shd w:fill="EDF5EF" w:color="auto" w:val="clear"/>
+            <w:tcMar>
+              <w:top w:type="dxa" w:w="80"/>
+              <w:left w:type="dxa" w:w="115"/>
+              <w:bottom w:type="dxa" w:w="80"/>
+              <w:right w:type="dxa" w:w="115"/>
+            </w:tcMar>
+          </w:tcPr>
+          <w:p>
+            <w:pPr>
+              <w:spacing w:after="0" w:line="252"/>
+            </w:pPr>
+            <w:r>
+              <w:rPr>
+                <w:rFonts w:ascii="Calibri" w:cs="Calibri" w:eastAsia="Calibri" w:hAnsi="Calibri"/>
+                <w:b/>
+                <w:bCs/>
+                <w:color w:val="1E6B34"/>
+                <w:sz w:val="18"/>
+                <w:szCs w:val="18"/>
+              </w:rPr>
+              <w:t xml:space="preserve">DONE</w:t>
+            </w:r>
+          </w:p>
+        </w:tc>
+        <w:tc>
+          <w:tcPr>
+            <w:tcW w:type="dxa" w:w="3200"/>
+            <w:tcMar>
+              <w:top w:type="dxa" w:w="80"/>
+              <w:left w:type="dxa" w:w="115"/>
+              <w:bottom w:type="dxa" w:w="80"/>
+              <w:right w:type="dxa" w:w="115"/>
+            </w:tcMar>
+          </w:tcPr>
+          <w:p>
+            <w:pPr>
+              <w:spacing w:after="0" w:line="252"/>
+            </w:pPr>
+            <w:r>
+              <w:rPr>
+                <w:rFonts w:ascii="Calibri" w:cs="Calibri" w:eastAsia="Calibri" w:hAnsi="Calibri"/>
+                <w:color w:val="1A1A1A"/>
+                <w:sz w:val="18"/>
+                <w:szCs w:val="18"/>
+              </w:rPr>
+              <w:t xml:space="preserve">commit f09f30d5: all 14,825 prompts, the data behind the 96-vs-7 result</w:t>
             </w:r>
           </w:p>
         </w:tc>
@@ -9069,51 +9126,79 @@
         </w:tc>
         <w:tc>
           <w:tcPr>
-            <w:tcW w:type="dxa" w:w="4300"/>
-            <w:tcMar>
-              <w:top w:type="dxa" w:w="80"/>
-              <w:left w:type="dxa" w:w="115"/>
-              <w:bottom w:type="dxa" w:w="80"/>
-              <w:right w:type="dxa" w:w="115"/>
-            </w:tcMar>
-          </w:tcPr>
-          <w:p>
-            <w:pPr>
-              <w:spacing w:after="0" w:line="252"/>
-            </w:pPr>
-            <w:r>
-              <w:rPr>
-                <w:rFonts w:ascii="Calibri" w:cs="Calibri" w:eastAsia="Calibri" w:hAnsi="Calibri"/>
-                <w:color w:val="1A1A1A"/>
-                <w:sz w:val="18"/>
-                <w:szCs w:val="18"/>
-              </w:rPr>
-              <w:t xml:space="preserve">Re-size the planted control to ~75 pairs in the strong stratum</w:t>
-            </w:r>
-          </w:p>
-        </w:tc>
-        <w:tc>
-          <w:tcPr>
-            <w:tcW w:type="dxa" w:w="4100"/>
-            <w:tcMar>
-              <w:top w:type="dxa" w:w="80"/>
-              <w:left w:type="dxa" w:w="115"/>
-              <w:bottom w:type="dxa" w:w="80"/>
-              <w:right w:type="dxa" w:w="115"/>
-            </w:tcMar>
-          </w:tcPr>
-          <w:p>
-            <w:pPr>
-              <w:spacing w:after="0" w:line="252"/>
-            </w:pPr>
-            <w:r>
-              <w:rPr>
-                <w:rFonts w:ascii="Calibri" w:cs="Calibri" w:eastAsia="Calibri" w:hAnsi="Calibri"/>
-                <w:color w:val="1A1A1A"/>
-                <w:sz w:val="18"/>
-                <w:szCs w:val="18"/>
-              </w:rPr>
-              <w:t xml:space="preserve">Under-sized this week; needs approval headroom to have any power</w:t>
+            <w:tcW w:type="dxa" w:w="3700"/>
+            <w:tcMar>
+              <w:top w:type="dxa" w:w="80"/>
+              <w:left w:type="dxa" w:w="115"/>
+              <w:bottom w:type="dxa" w:w="80"/>
+              <w:right w:type="dxa" w:w="115"/>
+            </w:tcMar>
+          </w:tcPr>
+          <w:p>
+            <w:pPr>
+              <w:spacing w:after="0" w:line="252"/>
+            </w:pPr>
+            <w:r>
+              <w:rPr>
+                <w:rFonts w:ascii="Calibri" w:cs="Calibri" w:eastAsia="Calibri" w:hAnsi="Calibri"/>
+                <w:color w:val="1A1A1A"/>
+                <w:sz w:val="18"/>
+                <w:szCs w:val="18"/>
+              </w:rPr>
+              <w:t xml:space="preserve">Per-model reporting; guard against pooling two models</w:t>
+            </w:r>
+          </w:p>
+        </w:tc>
+        <w:tc>
+          <w:tcPr>
+            <w:tcW w:type="dxa" w:w="1500"/>
+            <w:shd w:fill="EDF5EF" w:color="auto" w:val="clear"/>
+            <w:tcMar>
+              <w:top w:type="dxa" w:w="80"/>
+              <w:left w:type="dxa" w:w="115"/>
+              <w:bottom w:type="dxa" w:w="80"/>
+              <w:right w:type="dxa" w:w="115"/>
+            </w:tcMar>
+          </w:tcPr>
+          <w:p>
+            <w:pPr>
+              <w:spacing w:after="0" w:line="252"/>
+            </w:pPr>
+            <w:r>
+              <w:rPr>
+                <w:rFonts w:ascii="Calibri" w:cs="Calibri" w:eastAsia="Calibri" w:hAnsi="Calibri"/>
+                <w:b/>
+                <w:bCs/>
+                <w:color w:val="1E6B34"/>
+                <w:sz w:val="18"/>
+                <w:szCs w:val="18"/>
+              </w:rPr>
+              <w:t xml:space="preserve">DONE</w:t>
+            </w:r>
+          </w:p>
+        </w:tc>
+        <w:tc>
+          <w:tcPr>
+            <w:tcW w:type="dxa" w:w="3200"/>
+            <w:tcMar>
+              <w:top w:type="dxa" w:w="80"/>
+              <w:left w:type="dxa" w:w="115"/>
+              <w:bottom w:type="dxa" w:w="80"/>
+              <w:right w:type="dxa" w:w="115"/>
+            </w:tcMar>
+          </w:tcPr>
+          <w:p>
+            <w:pPr>
+              <w:spacing w:after="0" w:line="252"/>
+            </w:pPr>
+            <w:r>
+              <w:rPr>
+                <w:rFonts w:ascii="Calibri" w:cs="Calibri" w:eastAsia="Calibri" w:hAnsi="Calibri"/>
+                <w:color w:val="1A1A1A"/>
+                <w:sz w:val="18"/>
+                <w:szCs w:val="18"/>
+              </w:rPr>
+              <w:t xml:space="preserve">A shared log with two models silently produced numbers describing neither</w:t>
             </w:r>
           </w:p>
         </w:tc>
@@ -9146,51 +9231,79 @@
         </w:tc>
         <w:tc>
           <w:tcPr>
-            <w:tcW w:type="dxa" w:w="4300"/>
-            <w:tcMar>
-              <w:top w:type="dxa" w:w="80"/>
-              <w:left w:type="dxa" w:w="115"/>
-              <w:bottom w:type="dxa" w:w="80"/>
-              <w:right w:type="dxa" w:w="115"/>
-            </w:tcMar>
-          </w:tcPr>
-          <w:p>
-            <w:pPr>
-              <w:spacing w:after="0" w:line="252"/>
-            </w:pPr>
-            <w:r>
-              <w:rPr>
-                <w:rFonts w:ascii="Calibri" w:cs="Calibri" w:eastAsia="Calibri" w:hAnsi="Calibri"/>
-                <w:color w:val="1A1A1A"/>
-                <w:sz w:val="18"/>
-                <w:szCs w:val="18"/>
-              </w:rPr>
-              <w:t xml:space="preserve">Audit the second model end to end</w:t>
-            </w:r>
-          </w:p>
-        </w:tc>
-        <w:tc>
-          <w:tcPr>
-            <w:tcW w:type="dxa" w:w="4100"/>
-            <w:tcMar>
-              <w:top w:type="dxa" w:w="80"/>
-              <w:left w:type="dxa" w:w="115"/>
-              <w:bottom w:type="dxa" w:w="80"/>
-              <w:right w:type="dxa" w:w="115"/>
-            </w:tcMar>
-          </w:tcPr>
-          <w:p>
-            <w:pPr>
-              <w:spacing w:after="0" w:line="252"/>
-            </w:pPr>
-            <w:r>
-              <w:rPr>
-                <w:rFonts w:ascii="Calibri" w:cs="Calibri" w:eastAsia="Calibri" w:hAnsi="Calibri"/>
-                <w:color w:val="1A1A1A"/>
-                <w:sz w:val="18"/>
-                <w:szCs w:val="18"/>
-              </w:rPr>
-              <w:t xml:space="preserve">Decides whether this is a property of one system or of the class</w:t>
+            <w:tcW w:type="dxa" w:w="3700"/>
+            <w:tcMar>
+              <w:top w:type="dxa" w:w="80"/>
+              <w:left w:type="dxa" w:w="115"/>
+              <w:bottom w:type="dxa" w:w="80"/>
+              <w:right w:type="dxa" w:w="115"/>
+            </w:tcMar>
+          </w:tcPr>
+          <w:p>
+            <w:pPr>
+              <w:spacing w:after="0" w:line="252"/>
+            </w:pPr>
+            <w:r>
+              <w:rPr>
+                <w:rFonts w:ascii="Calibri" w:cs="Calibri" w:eastAsia="Calibri" w:hAnsi="Calibri"/>
+                <w:color w:val="1A1A1A"/>
+                <w:sz w:val="18"/>
+                <w:szCs w:val="18"/>
+              </w:rPr>
+              <w:t xml:space="preserve">Reproducible server rebuild + sweep runner</w:t>
+            </w:r>
+          </w:p>
+        </w:tc>
+        <w:tc>
+          <w:tcPr>
+            <w:tcW w:type="dxa" w:w="1500"/>
+            <w:shd w:fill="EDF5EF" w:color="auto" w:val="clear"/>
+            <w:tcMar>
+              <w:top w:type="dxa" w:w="80"/>
+              <w:left w:type="dxa" w:w="115"/>
+              <w:bottom w:type="dxa" w:w="80"/>
+              <w:right w:type="dxa" w:w="115"/>
+            </w:tcMar>
+          </w:tcPr>
+          <w:p>
+            <w:pPr>
+              <w:spacing w:after="0" w:line="252"/>
+            </w:pPr>
+            <w:r>
+              <w:rPr>
+                <w:rFonts w:ascii="Calibri" w:cs="Calibri" w:eastAsia="Calibri" w:hAnsi="Calibri"/>
+                <w:b/>
+                <w:bCs/>
+                <w:color w:val="1E6B34"/>
+                <w:sz w:val="18"/>
+                <w:szCs w:val="18"/>
+              </w:rPr>
+              <w:t xml:space="preserve">DONE</w:t>
+            </w:r>
+          </w:p>
+        </w:tc>
+        <w:tc>
+          <w:tcPr>
+            <w:tcW w:type="dxa" w:w="3200"/>
+            <w:tcMar>
+              <w:top w:type="dxa" w:w="80"/>
+              <w:left w:type="dxa" w:w="115"/>
+              <w:bottom w:type="dxa" w:w="80"/>
+              <w:right w:type="dxa" w:w="115"/>
+            </w:tcMar>
+          </w:tcPr>
+          <w:p>
+            <w:pPr>
+              <w:spacing w:after="0" w:line="252"/>
+            </w:pPr>
+            <w:r>
+              <w:rPr>
+                <w:rFonts w:ascii="Calibri" w:cs="Calibri" w:eastAsia="Calibri" w:hAnsi="Calibri"/>
+                <w:color w:val="1A1A1A"/>
+                <w:sz w:val="18"/>
+                <w:szCs w:val="18"/>
+              </w:rPr>
+              <w:t xml:space="preserve">bootstrap_server.py and run_models.sh; audited models are now version-controlled data</w:t>
             </w:r>
           </w:p>
         </w:tc>
@@ -9223,51 +9336,79 @@
         </w:tc>
         <w:tc>
           <w:tcPr>
-            <w:tcW w:type="dxa" w:w="4300"/>
-            <w:tcMar>
-              <w:top w:type="dxa" w:w="80"/>
-              <w:left w:type="dxa" w:w="115"/>
-              <w:bottom w:type="dxa" w:w="80"/>
-              <w:right w:type="dxa" w:w="115"/>
-            </w:tcMar>
-          </w:tcPr>
-          <w:p>
-            <w:pPr>
-              <w:spacing w:after="0" w:line="252"/>
-            </w:pPr>
-            <w:r>
-              <w:rPr>
-                <w:rFonts w:ascii="Calibri" w:cs="Calibri" w:eastAsia="Calibri" w:hAnsi="Calibri"/>
-                <w:color w:val="1A1A1A"/>
-                <w:sz w:val="18"/>
-                <w:szCs w:val="18"/>
-              </w:rPr>
-              <w:t xml:space="preserve">Write the five operationalized criteria; re-sign the checklist</w:t>
-            </w:r>
-          </w:p>
-        </w:tc>
-        <w:tc>
-          <w:tcPr>
-            <w:tcW w:type="dxa" w:w="4100"/>
-            <w:tcMar>
-              <w:top w:type="dxa" w:w="80"/>
-              <w:left w:type="dxa" w:w="115"/>
-              <w:bottom w:type="dxa" w:w="80"/>
-              <w:right w:type="dxa" w:w="115"/>
-            </w:tcMar>
-          </w:tcPr>
-          <w:p>
-            <w:pPr>
-              <w:spacing w:after="0" w:line="252"/>
-            </w:pPr>
-            <w:r>
-              <w:rPr>
-                <w:rFonts w:ascii="Calibri" w:cs="Calibri" w:eastAsia="Calibri" w:hAnsi="Calibri"/>
-                <w:color w:val="1A1A1A"/>
-                <w:sz w:val="18"/>
-                <w:szCs w:val="18"/>
-              </w:rPr>
-              <w:t xml:space="preserve">Carried two weeks. Blocks the judge and 152 transparency probes</w:t>
+            <w:tcW w:type="dxa" w:w="3700"/>
+            <w:tcMar>
+              <w:top w:type="dxa" w:w="80"/>
+              <w:left w:type="dxa" w:w="115"/>
+              <w:bottom w:type="dxa" w:w="80"/>
+              <w:right w:type="dxa" w:w="115"/>
+            </w:tcMar>
+          </w:tcPr>
+          <w:p>
+            <w:pPr>
+              <w:spacing w:after="0" w:line="252"/>
+            </w:pPr>
+            <w:r>
+              <w:rPr>
+                <w:rFonts w:ascii="Calibri" w:cs="Calibri" w:eastAsia="Calibri" w:hAnsi="Calibri"/>
+                <w:color w:val="1A1A1A"/>
+                <w:sz w:val="18"/>
+                <w:szCs w:val="18"/>
+              </w:rPr>
+              <w:t xml:space="preserve">Audit the second model end to end</w:t>
+            </w:r>
+          </w:p>
+        </w:tc>
+        <w:tc>
+          <w:tcPr>
+            <w:tcW w:type="dxa" w:w="1500"/>
+            <w:shd w:fill="FBEEEE" w:color="auto" w:val="clear"/>
+            <w:tcMar>
+              <w:top w:type="dxa" w:w="80"/>
+              <w:left w:type="dxa" w:w="115"/>
+              <w:bottom w:type="dxa" w:w="80"/>
+              <w:right w:type="dxa" w:w="115"/>
+            </w:tcMar>
+          </w:tcPr>
+          <w:p>
+            <w:pPr>
+              <w:spacing w:after="0" w:line="252"/>
+            </w:pPr>
+            <w:r>
+              <w:rPr>
+                <w:rFonts w:ascii="Calibri" w:cs="Calibri" w:eastAsia="Calibri" w:hAnsi="Calibri"/>
+                <w:b/>
+                <w:bCs/>
+                <w:color w:val="9B2C2C"/>
+                <w:sz w:val="18"/>
+                <w:szCs w:val="18"/>
+              </w:rPr>
+              <w:t xml:space="preserve">BLOCKED</w:t>
+            </w:r>
+          </w:p>
+        </w:tc>
+        <w:tc>
+          <w:tcPr>
+            <w:tcW w:type="dxa" w:w="3200"/>
+            <w:tcMar>
+              <w:top w:type="dxa" w:w="80"/>
+              <w:left w:type="dxa" w:w="115"/>
+              <w:bottom w:type="dxa" w:w="80"/>
+              <w:right w:type="dxa" w:w="115"/>
+            </w:tcMar>
+          </w:tcPr>
+          <w:p>
+            <w:pPr>
+              <w:spacing w:after="0" w:line="252"/>
+            </w:pPr>
+            <w:r>
+              <w:rPr>
+                <w:rFonts w:ascii="Calibri" w:cs="Calibri" w:eastAsia="Calibri" w:hAnsi="Calibri"/>
+                <w:color w:val="1A1A1A"/>
+                <w:sz w:val="18"/>
+                <w:szCs w:val="18"/>
+              </w:rPr>
+              <w:t xml:space="preserve">Not a design problem — the container recycles roughly every 30 minutes</w:t>
             </w:r>
           </w:p>
         </w:tc>
@@ -9300,51 +9441,78 @@
         </w:tc>
         <w:tc>
           <w:tcPr>
-            <w:tcW w:type="dxa" w:w="4300"/>
-            <w:tcMar>
-              <w:top w:type="dxa" w:w="80"/>
-              <w:left w:type="dxa" w:w="115"/>
-              <w:bottom w:type="dxa" w:w="80"/>
-              <w:right w:type="dxa" w:w="115"/>
-            </w:tcMar>
-          </w:tcPr>
-          <w:p>
-            <w:pPr>
-              <w:spacing w:after="0" w:line="252"/>
-            </w:pPr>
-            <w:r>
-              <w:rPr>
-                <w:rFonts w:ascii="Calibri" w:cs="Calibri" w:eastAsia="Calibri" w:hAnsi="Calibri"/>
-                <w:color w:val="1A1A1A"/>
-                <w:sz w:val="18"/>
-                <w:szCs w:val="18"/>
-              </w:rPr>
-              <w:t xml:space="preserve">Decide and record the position on consistency and truthfulness</w:t>
-            </w:r>
-          </w:p>
-        </w:tc>
-        <w:tc>
-          <w:tcPr>
-            <w:tcW w:type="dxa" w:w="4100"/>
-            <w:tcMar>
-              <w:top w:type="dxa" w:w="80"/>
-              <w:left w:type="dxa" w:w="115"/>
-              <w:bottom w:type="dxa" w:w="80"/>
-              <w:right w:type="dxa" w:w="115"/>
-            </w:tcMar>
-          </w:tcPr>
-          <w:p>
-            <w:pPr>
-              <w:spacing w:after="0" w:line="252"/>
-            </w:pPr>
-            <w:r>
-              <w:rPr>
-                <w:rFonts w:ascii="Calibri" w:cs="Calibri" w:eastAsia="Calibri" w:hAnsi="Calibri"/>
-                <w:color w:val="1A1A1A"/>
-                <w:sz w:val="18"/>
-                <w:szCs w:val="18"/>
-              </w:rPr>
-              <w:t xml:space="preserve">Two of five dimensions produce no probes; this must be a decision, not a discovery</w:t>
+            <w:tcW w:type="dxa" w:w="3700"/>
+            <w:tcMar>
+              <w:top w:type="dxa" w:w="80"/>
+              <w:left w:type="dxa" w:w="115"/>
+              <w:bottom w:type="dxa" w:w="80"/>
+              <w:right w:type="dxa" w:w="115"/>
+            </w:tcMar>
+          </w:tcPr>
+          <w:p>
+            <w:pPr>
+              <w:spacing w:after="0" w:line="252"/>
+            </w:pPr>
+            <w:r>
+              <w:rPr>
+                <w:rFonts w:ascii="Calibri" w:cs="Calibri" w:eastAsia="Calibri" w:hAnsi="Calibri"/>
+                <w:color w:val="1A1A1A"/>
+                <w:sz w:val="18"/>
+                <w:szCs w:val="18"/>
+              </w:rPr>
+              <w:t xml:space="preserve">Deterministic jury</w:t>
+            </w:r>
+          </w:p>
+        </w:tc>
+        <w:tc>
+          <w:tcPr>
+            <w:tcW w:type="dxa" w:w="1500"/>
+            <w:tcMar>
+              <w:top w:type="dxa" w:w="80"/>
+              <w:left w:type="dxa" w:w="115"/>
+              <w:bottom w:type="dxa" w:w="80"/>
+              <w:right w:type="dxa" w:w="115"/>
+            </w:tcMar>
+          </w:tcPr>
+          <w:p>
+            <w:pPr>
+              <w:spacing w:after="0" w:line="252"/>
+            </w:pPr>
+            <w:r>
+              <w:rPr>
+                <w:rFonts w:ascii="Calibri" w:cs="Calibri" w:eastAsia="Calibri" w:hAnsi="Calibri"/>
+                <w:b/>
+                <w:bCs/>
+                <w:color w:val="8A5A00"/>
+                <w:sz w:val="18"/>
+                <w:szCs w:val="18"/>
+              </w:rPr>
+              <w:t xml:space="preserve">To do</w:t>
+            </w:r>
+          </w:p>
+        </w:tc>
+        <w:tc>
+          <w:tcPr>
+            <w:tcW w:type="dxa" w:w="3200"/>
+            <w:tcMar>
+              <w:top w:type="dxa" w:w="80"/>
+              <w:left w:type="dxa" w:w="115"/>
+              <w:bottom w:type="dxa" w:w="80"/>
+              <w:right w:type="dxa" w:w="115"/>
+            </w:tcMar>
+          </w:tcPr>
+          <w:p>
+            <w:pPr>
+              <w:spacing w:after="0" w:line="252"/>
+            </w:pPr>
+            <w:r>
+              <w:rPr>
+                <w:rFonts w:ascii="Calibri" w:cs="Calibri" w:eastAsia="Calibri" w:hAnsi="Calibri"/>
+                <w:color w:val="1A1A1A"/>
+                <w:sz w:val="18"/>
+                <w:szCs w:val="18"/>
+              </w:rPr>
+              <w:t xml:space="preserve">The finding must come from audited code, not an analysis cell</w:t>
             </w:r>
           </w:p>
         </w:tc>
@@ -9377,56 +9545,178 @@
         </w:tc>
         <w:tc>
           <w:tcPr>
-            <w:tcW w:type="dxa" w:w="4300"/>
-            <w:tcMar>
-              <w:top w:type="dxa" w:w="80"/>
-              <w:left w:type="dxa" w:w="115"/>
-              <w:bottom w:type="dxa" w:w="80"/>
-              <w:right w:type="dxa" w:w="115"/>
-            </w:tcMar>
-          </w:tcPr>
-          <w:p>
-            <w:pPr>
-              <w:spacing w:after="0" w:line="252"/>
-            </w:pPr>
-            <w:r>
-              <w:rPr>
-                <w:rFonts w:ascii="Calibri" w:cs="Calibri" w:eastAsia="Calibri" w:hAnsi="Calibri"/>
-                <w:color w:val="1A1A1A"/>
-                <w:sz w:val="18"/>
-                <w:szCs w:val="18"/>
-              </w:rPr>
-              <w:t xml:space="preserve">Server bootstrap script committed</w:t>
-            </w:r>
-          </w:p>
-        </w:tc>
-        <w:tc>
-          <w:tcPr>
-            <w:tcW w:type="dxa" w:w="4100"/>
-            <w:tcMar>
-              <w:top w:type="dxa" w:w="80"/>
-              <w:left w:type="dxa" w:w="115"/>
-              <w:bottom w:type="dxa" w:w="80"/>
-              <w:right w:type="dxa" w:w="115"/>
-            </w:tcMar>
-          </w:tcPr>
-          <w:p>
-            <w:pPr>
-              <w:spacing w:after="0" w:line="252"/>
-            </w:pPr>
-            <w:r>
-              <w:rPr>
-                <w:rFonts w:ascii="Calibri" w:cs="Calibri" w:eastAsia="Calibri" w:hAnsi="Calibri"/>
-                <w:color w:val="1A1A1A"/>
-                <w:sz w:val="18"/>
-                <w:szCs w:val="18"/>
-              </w:rPr>
-              <w:t xml:space="preserve">Done — venv and model cache now persist across container recycles</w:t>
+            <w:tcW w:type="dxa" w:w="3700"/>
+            <w:tcMar>
+              <w:top w:type="dxa" w:w="80"/>
+              <w:left w:type="dxa" w:w="115"/>
+              <w:bottom w:type="dxa" w:w="80"/>
+              <w:right w:type="dxa" w:w="115"/>
+            </w:tcMar>
+          </w:tcPr>
+          <w:p>
+            <w:pPr>
+              <w:spacing w:after="0" w:line="252"/>
+            </w:pPr>
+            <w:r>
+              <w:rPr>
+                <w:rFonts w:ascii="Calibri" w:cs="Calibri" w:eastAsia="Calibri" w:hAnsi="Calibri"/>
+                <w:color w:val="1A1A1A"/>
+                <w:sz w:val="18"/>
+                <w:szCs w:val="18"/>
+              </w:rPr>
+              <w:t xml:space="preserve">Five operationalized criteria; re-sign the checklist</w:t>
+            </w:r>
+          </w:p>
+        </w:tc>
+        <w:tc>
+          <w:tcPr>
+            <w:tcW w:type="dxa" w:w="1500"/>
+            <w:tcMar>
+              <w:top w:type="dxa" w:w="80"/>
+              <w:left w:type="dxa" w:w="115"/>
+              <w:bottom w:type="dxa" w:w="80"/>
+              <w:right w:type="dxa" w:w="115"/>
+            </w:tcMar>
+          </w:tcPr>
+          <w:p>
+            <w:pPr>
+              <w:spacing w:after="0" w:line="252"/>
+            </w:pPr>
+            <w:r>
+              <w:rPr>
+                <w:rFonts w:ascii="Calibri" w:cs="Calibri" w:eastAsia="Calibri" w:hAnsi="Calibri"/>
+                <w:b/>
+                <w:bCs/>
+                <w:color w:val="9B2C2C"/>
+                <w:sz w:val="18"/>
+                <w:szCs w:val="18"/>
+              </w:rPr>
+              <w:t xml:space="preserve">To do</w:t>
+            </w:r>
+          </w:p>
+        </w:tc>
+        <w:tc>
+          <w:tcPr>
+            <w:tcW w:type="dxa" w:w="3200"/>
+            <w:tcMar>
+              <w:top w:type="dxa" w:w="80"/>
+              <w:left w:type="dxa" w:w="115"/>
+              <w:bottom w:type="dxa" w:w="80"/>
+              <w:right w:type="dxa" w:w="115"/>
+            </w:tcMar>
+          </w:tcPr>
+          <w:p>
+            <w:pPr>
+              <w:spacing w:after="0" w:line="252"/>
+            </w:pPr>
+            <w:r>
+              <w:rPr>
+                <w:rFonts w:ascii="Calibri" w:cs="Calibri" w:eastAsia="Calibri" w:hAnsi="Calibri"/>
+                <w:color w:val="1A1A1A"/>
+                <w:sz w:val="18"/>
+                <w:szCs w:val="18"/>
+              </w:rPr>
+              <w:t xml:space="preserve">Carried three weeks. Blocks the judge and 152 answered transparency probes</w:t>
             </w:r>
           </w:p>
         </w:tc>
       </w:tr>
     </w:tbl>
+    <w:p>
+      <w:pPr>
+        <w:pStyle w:val="Heading2"/>
+        <w:spacing w:after="105" w:before="220"/>
+      </w:pPr>
+      <w:r>
+        <w:rPr>
+          <w:rFonts w:ascii="Calibri" w:cs="Calibri" w:eastAsia="Calibri" w:hAnsi="Calibri"/>
+          <w:b/>
+          <w:bCs/>
+          <w:color w:val="8A5A00"/>
+          <w:sz w:val="23"/>
+          <w:szCs w:val="23"/>
+        </w:rPr>
+        <w:t xml:space="preserve">What the week has cost</w:t>
+      </w:r>
+    </w:p>
+    <w:p>
+      <w:pPr>
+        <w:spacing w:after="125" w:line="274"/>
+      </w:pPr>
+      <w:r>
+        <w:rPr>
+          <w:rFonts w:ascii="Calibri" w:cs="Calibri" w:eastAsia="Calibri" w:hAnsi="Calibri"/>
+          <w:color w:val="1A1A1A"/>
+          <w:sz w:val="20"/>
+          <w:szCs w:val="20"/>
+        </w:rPr>
+        <w:t xml:space="preserve">Five container recycles in a single day. The persistent volume is read-only to the notebook user, so each one discards the virtual environment, the 15 GB model cache and the working tree. A ninety-minute four-model sweep cannot complete inside a thirty-minute window, which is why the second model is blocked on infrastructure rather than on anything the audit does.</w:t>
+      </w:r>
+    </w:p>
+    <w:p>
+      <w:pPr>
+        <w:spacing w:after="125" w:line="274"/>
+      </w:pPr>
+      <w:r>
+        <w:rPr>
+          <w:rFonts w:ascii="Calibri" w:cs="Calibri" w:eastAsia="Calibri" w:hAnsi="Calibri"/>
+          <w:b/>
+          <w:bCs/>
+          <w:color w:val="1A1A1A"/>
+          <w:sz w:val="21"/>
+          <w:szCs w:val="21"/>
+        </w:rPr>
+        <w:t xml:space="preserve">What was built in response, rather than merely endured: </w:t>
+      </w:r>
+      <w:r>
+        <w:rPr>
+          <w:rFonts w:ascii="Calibri" w:cs="Calibri" w:eastAsia="Calibri" w:hAnsi="Calibri"/>
+          <w:color w:val="1A1A1A"/>
+          <w:sz w:val="21"/>
+          <w:szCs w:val="21"/>
+        </w:rPr>
+        <w:t xml:space="preserve">a bootstrap script that rebuilds the environment in one command and reuses any writable persistent directory it can find; a sweep runner holding an atomic lock with staleness detection, so a relaunch after a killed run takes over instead of putting two vLLM processes on one card; a wait for the GPU to be released before starting, because a sweep that begins while the previous one is letting go fails its first model for no reason; and a push after every model, because a recycle should cost the model in flight and nothing more.</w:t>
+      </w:r>
+    </w:p>
+    <w:p>
+      <w:pPr>
+        <w:spacing w:after="125" w:line="274"/>
+      </w:pPr>
+      <w:r>
+        <w:rPr>
+          <w:rFonts w:ascii="Calibri" w:cs="Calibri" w:eastAsia="Calibri" w:hAnsi="Calibri"/>
+          <w:color w:val="1A1A1A"/>
+          <w:sz w:val="20"/>
+          <w:szCs w:val="20"/>
+        </w:rPr>
+        <w:t xml:space="preserve">Two further code faults surfaced while doing it, both mine and both the same shape as the Week 2 error — a comparison between two numbers in different units, and a control allowed to veto a result it was never designed to judge. The flip-rate verdict compared a per-comparison rate against a per-base-case assumption and would have fired on every healthy run from now on. The planted-axis control still declared a significant finding uninterpretable, when the significant finding is itself stronger evidence of axis sensitivity than the control could ever supply. Both now have tests.</w:t>
+      </w:r>
+    </w:p>
+    <w:p>
+      <w:pPr>
+        <w:spacing w:after="125" w:line="274"/>
+      </w:pPr>
+      <w:r>
+        <w:rPr>
+          <w:rFonts w:ascii="Calibri" w:cs="Calibri" w:eastAsia="Calibri" w:hAnsi="Calibri"/>
+          <w:b/>
+          <w:bCs/>
+          <w:color w:val="1A1A1A"/>
+          <w:sz w:val="21"/>
+          <w:szCs w:val="21"/>
+        </w:rPr>
+        <w:t xml:space="preserve">The design held up under all of it. </w:t>
+      </w:r>
+      <w:r>
+        <w:rPr>
+          <w:rFonts w:ascii="Calibri" w:cs="Calibri" w:eastAsia="Calibri" w:hAnsi="Calibri"/>
+          <w:color w:val="1A1A1A"/>
+          <w:sz w:val="21"/>
+          <w:szCs w:val="21"/>
+        </w:rPr>
+        <w:t xml:space="preserve">The probe set regenerated to content hash e0d72184 on three separate fresh containers from a fresh clone, and the response log was recovered from version control twice. Reproducibility from a seed and a signature stopped being a claim about the architecture this week and became an operational fact.</w:t>
+      </w:r>
+    </w:p>
     <w:p>
       <w:pPr>
         <w:spacing w:after="70" w:before="150"/>
@@ -11294,64 +11584,68 @@
             <w:r>
               <w:rPr>
                 <w:rFonts w:ascii="Calibri" w:cs="Calibri" w:eastAsia="Calibri" w:hAnsi="Calibri"/>
-                <w:color w:val="1A1A1A"/>
-                <w:sz w:val="18"/>
-                <w:szCs w:val="18"/>
-              </w:rPr>
-              <w:t xml:space="preserve">R6</w:t>
-            </w:r>
-          </w:p>
-        </w:tc>
-        <w:tc>
-          <w:tcPr>
-            <w:tcW w:type="dxa" w:w="3300"/>
-            <w:tcMar>
-              <w:top w:type="dxa" w:w="80"/>
-              <w:left w:type="dxa" w:w="115"/>
-              <w:bottom w:type="dxa" w:w="80"/>
-              <w:right w:type="dxa" w:w="115"/>
-            </w:tcMar>
-          </w:tcPr>
-          <w:p>
-            <w:pPr>
-              <w:spacing w:after="0" w:line="252"/>
-            </w:pPr>
-            <w:r>
-              <w:rPr>
-                <w:rFonts w:ascii="Calibri" w:cs="Calibri" w:eastAsia="Calibri" w:hAnsi="Calibri"/>
-                <w:color w:val="1A1A1A"/>
-                <w:sz w:val="18"/>
-                <w:szCs w:val="18"/>
-              </w:rPr>
-              <w:t xml:space="preserve">Server container recycled; environment and 15 GB model cache lost</w:t>
-            </w:r>
-          </w:p>
-        </w:tc>
-        <w:tc>
-          <w:tcPr>
-            <w:tcW w:type="dxa" w:w="1100"/>
-            <w:shd w:fill="FBF4E8" w:color="auto" w:val="clear"/>
-            <w:tcMar>
-              <w:top w:type="dxa" w:w="80"/>
-              <w:left w:type="dxa" w:w="115"/>
-              <w:bottom w:type="dxa" w:w="80"/>
-              <w:right w:type="dxa" w:w="115"/>
-            </w:tcMar>
-          </w:tcPr>
-          <w:p>
-            <w:pPr>
-              <w:spacing w:after="0" w:line="252"/>
-            </w:pPr>
-            <w:r>
-              <w:rPr>
-                <w:rFonts w:ascii="Calibri" w:cs="Calibri" w:eastAsia="Calibri" w:hAnsi="Calibri"/>
                 <w:b/>
                 <w:bCs/>
-                <w:color w:val="8A5A00"/>
-                <w:sz w:val="18"/>
-                <w:szCs w:val="18"/>
-              </w:rPr>
-              <w:t xml:space="preserve">Medium</w:t>
+                <w:color w:val="1A1A1A"/>
+                <w:sz w:val="18"/>
+                <w:szCs w:val="18"/>
+              </w:rPr>
+              <w:t xml:space="preserve">R6</w:t>
+            </w:r>
+          </w:p>
+        </w:tc>
+        <w:tc>
+          <w:tcPr>
+            <w:tcW w:type="dxa" w:w="3300"/>
+            <w:tcMar>
+              <w:top w:type="dxa" w:w="80"/>
+              <w:left w:type="dxa" w:w="115"/>
+              <w:bottom w:type="dxa" w:w="80"/>
+              <w:right w:type="dxa" w:w="115"/>
+            </w:tcMar>
+          </w:tcPr>
+          <w:p>
+            <w:pPr>
+              <w:spacing w:after="0" w:line="252"/>
+            </w:pPr>
+            <w:r>
+              <w:rPr>
+                <w:rFonts w:ascii="Calibri" w:cs="Calibri" w:eastAsia="Calibri" w:hAnsi="Calibri"/>
+                <w:b/>
+                <w:bCs/>
+                <w:color w:val="1A1A1A"/>
+                <w:sz w:val="18"/>
+                <w:szCs w:val="18"/>
+              </w:rPr>
+              <w:t xml:space="preserve">Server container recycles roughly every 30 minutes; no writable persistent directory exists</w:t>
+            </w:r>
+          </w:p>
+        </w:tc>
+        <w:tc>
+          <w:tcPr>
+            <w:tcW w:type="dxa" w:w="1100"/>
+            <w:shd w:fill="FBEEEE" w:color="auto" w:val="clear"/>
+            <w:tcMar>
+              <w:top w:type="dxa" w:w="80"/>
+              <w:left w:type="dxa" w:w="115"/>
+              <w:bottom w:type="dxa" w:w="80"/>
+              <w:right w:type="dxa" w:w="115"/>
+            </w:tcMar>
+          </w:tcPr>
+          <w:p>
+            <w:pPr>
+              <w:spacing w:after="0" w:line="252"/>
+            </w:pPr>
+            <w:r>
+              <w:rPr>
+                <w:rFonts w:ascii="Calibri" w:cs="Calibri" w:eastAsia="Calibri" w:hAnsi="Calibri"/>
+                <w:b/>
+                <w:bCs/>
+                <w:color w:val="9B2C2C"/>
+                <w:sz w:val="18"/>
+                <w:szCs w:val="18"/>
+              </w:rPr>
+              <w:t xml:space="preserve">High</w:t>
             </w:r>
           </w:p>
         </w:tc>
@@ -11372,11 +11666,13 @@
             <w:r>
               <w:rPr>
                 <w:rFonts w:ascii="Calibri" w:cs="Calibri" w:eastAsia="Calibri" w:hAnsi="Calibri"/>
-                <w:color w:val="1A1A1A"/>
-                <w:sz w:val="18"/>
-                <w:szCs w:val="18"/>
-              </w:rPr>
-              <w:t xml:space="preserve">Occurred three times. Git is the persistence layer and the full rebuild is scripted; the run itself is only minutes</w:t>
+                <w:b/>
+                <w:bCs/>
+                <w:color w:val="1A1A1A"/>
+                <w:sz w:val="18"/>
+                <w:szCs w:val="18"/>
+              </w:rPr>
+              <w:t xml:space="preserve">RAISED from Medium — five recycles on 18 Aug alone, now the largest single cost to the project. Mitigated by scripted rebuild, per-model push and one-model-at-a-time runs. Resolved outright by one writable folder on the vault volume; request pending</w:t>
             </w:r>
           </w:p>
         </w:tc>
@@ -11955,7 +12251,7 @@
                 <w:sz w:val="18"/>
                 <w:szCs w:val="18"/>
               </w:rPr>
-              <w:t xml:space="preserve">1 of 2 run and measured; second model is the Week 3 priority</w:t>
+              <w:t xml:space="preserve">1 of 2 run, measured and banked; the second is blocked on server stability, not on method</w:t>
             </w:r>
           </w:p>
         </w:tc>
@@ -12093,7 +12389,7 @@
           <w:sz w:val="17"/>
           <w:szCs w:val="17"/>
         </w:rPr>
-        <w:t xml:space="preserve">183 tests passing  ·  16,784 responses logged  ·  probe set 14,825 prompts  ·  checklist fb4c3454  ·  German Credit 1000 records (CC BY 4.0)</w:t>
+        <w:t xml:space="preserve">184 tests passing  ·  14,825 responses banked on GitHub  ·  probe set e0d72184  ·  checklist fb4c3454  ·  German Credit 1000 records (CC BY 4.0)</w:t>
       </w:r>
     </w:p>
     <w:sectPr>

</xml_diff>

<commit_message>
Jury: hash matching, exact tails by symmetry; corrected finding in progress log
</commit_message>
<xml_diff>
--- a/docs/GRAIL_weekly_progress.docx
+++ b/docs/GRAIL_weekly_progress.docx
@@ -350,7 +350,7 @@
                 <w:sz w:val="18"/>
                 <w:szCs w:val="18"/>
               </w:rPr>
-              <w:t xml:space="preserve">184 tests · finding banked on GitHub</w:t>
+              <w:t xml:space="preserve">204 tests · jury built, finding verified</w:t>
             </w:r>
           </w:p>
         </w:tc>
@@ -375,7 +375,7 @@
                 <w:sz w:val="18"/>
                 <w:szCs w:val="18"/>
               </w:rPr>
-              <w:t xml:space="preserve">Second model + deterministic jury</w:t>
+              <w:t xml:space="preserve">Second model + planted control re-size</w:t>
             </w:r>
           </w:p>
         </w:tc>
@@ -449,7 +449,7 @@
           <w:sz w:val="21"/>
           <w:szCs w:val="21"/>
         </w:rPr>
-        <w:t xml:space="preserve">the corrected instrument has produced the project’s first significant finding. Across 4,740 matched pairs the audited model approves female-titled applicants more often than identical male ones — 96 discordant pairs to 7, p = 4 × 10⁻²¹. The design fault found earlier in the week is why it was found at all: the original sizing could not have detected an effect this size. Roughly 65% of the software, roughly 40% of the empirical evidence.</w:t>
+        <w:t xml:space="preserve">the corrected instrument has produced the project’s first significant finding. Across 4,740 matched pairs the audited model approves female-titled applicants more often than identical male ones — 94 discordant pairs to 1, p = 5 × 10⁻²⁷. The design fault found earlier in the week is why it was found at all: the original sizing could not have detected an effect this size. Roughly 65% of the software, roughly 40% of the empirical evidence.</w:t>
       </w:r>
     </w:p>
     <w:p>
@@ -7443,7 +7443,7 @@
                 <w:sz w:val="18"/>
                 <w:szCs w:val="18"/>
               </w:rPr>
-              <w:t xml:space="preserve">15</w:t>
+              <w:t xml:space="preserve">13</w:t>
             </w:r>
           </w:p>
         </w:tc>
@@ -7493,7 +7493,7 @@
                 <w:sz w:val="18"/>
                 <w:szCs w:val="18"/>
               </w:rPr>
-              <w:t xml:space="preserve">p = 6.1 × 10⁻⁵</w:t>
+              <w:t xml:space="preserve">p = 2.4 × 10⁻⁴</w:t>
             </w:r>
           </w:p>
         </w:tc>
@@ -7595,7 +7595,7 @@
                 <w:sz w:val="18"/>
                 <w:szCs w:val="18"/>
               </w:rPr>
-              <w:t xml:space="preserve">7</w:t>
+              <w:t xml:space="preserve">1</w:t>
             </w:r>
           </w:p>
         </w:tc>
@@ -7620,7 +7620,7 @@
                 <w:sz w:val="18"/>
                 <w:szCs w:val="18"/>
               </w:rPr>
-              <w:t xml:space="preserve">p = 2.4 × 10⁻¹¹</w:t>
+              <w:t xml:space="preserve">p = 1.1 × 10⁻¹⁶</w:t>
             </w:r>
           </w:p>
         </w:tc>
@@ -7831,7 +7831,7 @@
                 <w:sz w:val="18"/>
                 <w:szCs w:val="18"/>
               </w:rPr>
-              <w:t xml:space="preserve">96</w:t>
+              <w:t xml:space="preserve">94</w:t>
             </w:r>
           </w:p>
         </w:tc>
@@ -7858,7 +7858,7 @@
                 <w:sz w:val="18"/>
                 <w:szCs w:val="18"/>
               </w:rPr>
-              <w:t xml:space="preserve">7</w:t>
+              <w:t xml:space="preserve">1</w:t>
             </w:r>
           </w:p>
         </w:tc>
@@ -7885,7 +7885,7 @@
                 <w:sz w:val="18"/>
                 <w:szCs w:val="18"/>
               </w:rPr>
-              <w:t xml:space="preserve">p = 4.2 × 10⁻²¹</w:t>
+              <w:t xml:space="preserve">p = 4.8 × 10⁻²⁷</w:t>
             </w:r>
           </w:p>
         </w:tc>
@@ -8044,7 +8044,7 @@
                 <w:sz w:val="18"/>
                 <w:szCs w:val="18"/>
               </w:rPr>
-              <w:t xml:space="preserve">+1.83 pp female-favoured</w:t>
+              <w:t xml:space="preserve">+2.04 pp female-favoured</w:t>
             </w:r>
           </w:p>
         </w:tc>
@@ -8069,7 +8069,7 @@
                 <w:sz w:val="18"/>
                 <w:szCs w:val="18"/>
               </w:rPr>
-              <w:t xml:space="preserve">+1.27 to +2.38 pp</w:t>
+              <w:t xml:space="preserve">+1.55 to +2.61 pp</w:t>
             </w:r>
           </w:p>
         </w:tc>
@@ -8096,7 +8096,7 @@
                 <w:sz w:val="18"/>
                 <w:szCs w:val="18"/>
               </w:rPr>
-              <w:t xml:space="preserve">Discordance rate</w:t>
+              <w:t xml:space="preserve">Paired difference (all strata pooled)</w:t>
             </w:r>
           </w:p>
         </w:tc>
@@ -8121,7 +8121,7 @@
                 <w:sz w:val="18"/>
                 <w:szCs w:val="18"/>
               </w:rPr>
-              <w:t xml:space="preserve">2.32% of pairs</w:t>
+              <w:t xml:space="preserve">+1.96 pp female-favoured</w:t>
             </w:r>
           </w:p>
         </w:tc>
@@ -8146,7 +8146,7 @@
                 <w:sz w:val="18"/>
                 <w:szCs w:val="18"/>
               </w:rPr>
-              <w:t xml:space="preserve">—</w:t>
+              <w:t xml:space="preserve">+1.59 to +2.39 pp</w:t>
             </w:r>
           </w:p>
         </w:tc>
@@ -8173,7 +8173,7 @@
                 <w:sz w:val="18"/>
                 <w:szCs w:val="18"/>
               </w:rPr>
-              <w:t xml:space="preserve">Share of discordant pairs favouring female</w:t>
+              <w:t xml:space="preserve">Discordance rate</w:t>
             </w:r>
           </w:p>
         </w:tc>
@@ -8198,7 +8198,7 @@
                 <w:sz w:val="18"/>
                 <w:szCs w:val="18"/>
               </w:rPr>
-              <w:t xml:space="preserve">89.4%</w:t>
+              <w:t xml:space="preserve">2.11% of pairs</w:t>
             </w:r>
           </w:p>
         </w:tc>
@@ -8223,7 +8223,7 @@
                 <w:sz w:val="18"/>
                 <w:szCs w:val="18"/>
               </w:rPr>
-              <w:t xml:space="preserve">79.4% to 95.6%</w:t>
+              <w:t xml:space="preserve">1.64% to 2.71%</w:t>
             </w:r>
           </w:p>
         </w:tc>
@@ -8250,6 +8250,83 @@
                 <w:sz w:val="18"/>
                 <w:szCs w:val="18"/>
               </w:rPr>
+              <w:t xml:space="preserve">Share of discordant pairs favouring female</w:t>
+            </w:r>
+          </w:p>
+        </w:tc>
+        <w:tc>
+          <w:tcPr>
+            <w:tcW w:type="dxa" w:w="2400"/>
+            <w:tcMar>
+              <w:top w:type="dxa" w:w="80"/>
+              <w:left w:type="dxa" w:w="115"/>
+              <w:bottom w:type="dxa" w:w="80"/>
+              <w:right w:type="dxa" w:w="115"/>
+            </w:tcMar>
+          </w:tcPr>
+          <w:p>
+            <w:pPr>
+              <w:spacing w:after="0" w:line="252"/>
+            </w:pPr>
+            <w:r>
+              <w:rPr>
+                <w:rFonts w:ascii="Calibri" w:cs="Calibri" w:eastAsia="Calibri" w:hAnsi="Calibri"/>
+                <w:color w:val="1A1A1A"/>
+                <w:sz w:val="18"/>
+                <w:szCs w:val="18"/>
+              </w:rPr>
+              <w:t xml:space="preserve">98.3%</w:t>
+            </w:r>
+          </w:p>
+        </w:tc>
+        <w:tc>
+          <w:tcPr>
+            <w:tcW w:type="dxa" w:w="3220"/>
+            <w:tcMar>
+              <w:top w:type="dxa" w:w="80"/>
+              <w:left w:type="dxa" w:w="115"/>
+              <w:bottom w:type="dxa" w:w="80"/>
+              <w:right w:type="dxa" w:w="115"/>
+            </w:tcMar>
+          </w:tcPr>
+          <w:p>
+            <w:pPr>
+              <w:spacing w:after="0" w:line="252"/>
+            </w:pPr>
+            <w:r>
+              <w:rPr>
+                <w:rFonts w:ascii="Calibri" w:cs="Calibri" w:eastAsia="Calibri" w:hAnsi="Calibri"/>
+                <w:color w:val="1A1A1A"/>
+                <w:sz w:val="18"/>
+                <w:szCs w:val="18"/>
+              </w:rPr>
+              <w:t xml:space="preserve">91.1% to 100%</w:t>
+            </w:r>
+          </w:p>
+        </w:tc>
+      </w:tr>
+      <w:tr>
+        <w:tc>
+          <w:tcPr>
+            <w:tcW w:type="dxa" w:w="3400"/>
+            <w:tcMar>
+              <w:top w:type="dxa" w:w="80"/>
+              <w:left w:type="dxa" w:w="115"/>
+              <w:bottom w:type="dxa" w:w="80"/>
+              <w:right w:type="dxa" w:w="115"/>
+            </w:tcMar>
+          </w:tcPr>
+          <w:p>
+            <w:pPr>
+              <w:spacing w:after="0" w:line="252"/>
+            </w:pPr>
+            <w:r>
+              <w:rPr>
+                <w:rFonts w:ascii="Calibri" w:cs="Calibri" w:eastAsia="Calibri" w:hAnsi="Calibri"/>
+                <w:color w:val="1A1A1A"/>
+                <w:sz w:val="18"/>
+                <w:szCs w:val="18"/>
+              </w:rPr>
               <w:t xml:space="preserve">Pre-registered ψ = 0.75; observed</w:t>
             </w:r>
           </w:p>
@@ -8275,7 +8352,7 @@
                 <w:sz w:val="18"/>
                 <w:szCs w:val="18"/>
               </w:rPr>
-              <w:t xml:space="preserve">0.894</w:t>
+              <w:t xml:space="preserve">0.983</w:t>
             </w:r>
           </w:p>
         </w:tc>
@@ -8300,7 +8377,7 @@
                 <w:sz w:val="18"/>
                 <w:szCs w:val="18"/>
               </w:rPr>
-              <w:t xml:space="preserve">the design was conservative</w:t>
+              <w:t xml:space="preserve">the design was very conservative</w:t>
             </w:r>
           </w:p>
         </w:tc>
@@ -8319,7 +8396,7 @@
           <w:sz w:val="21"/>
           <w:szCs w:val="21"/>
         </w:rPr>
-        <w:t xml:space="preserve">The effect holds in all three strata, and in weak and strong it is unanimous — not one pair went the other way. </w:t>
+        <w:t xml:space="preserve">The effect holds in all three strata, and in weak and strong it is unanimous, and across all 4,740 pairs exactly one went the other way. </w:t>
       </w:r>
       <w:r>
         <w:rPr>
@@ -8345,6 +8422,100 @@
           <w:sz w:val="23"/>
           <w:szCs w:val="23"/>
         </w:rPr>
+        <w:t xml:space="preserve">The numbers were corrected once, by a second implementation</w:t>
+      </w:r>
+    </w:p>
+    <w:p>
+      <w:pPr>
+        <w:spacing w:after="125" w:line="274"/>
+      </w:pPr>
+      <w:r>
+        <w:rPr>
+          <w:rFonts w:ascii="Calibri" w:cs="Calibri" w:eastAsia="Calibri" w:hAnsi="Calibri"/>
+          <w:color w:val="1A1A1A"/>
+          <w:sz w:val="20"/>
+          <w:szCs w:val="20"/>
+        </w:rPr>
+        <w:t xml:space="preserve">The figures above are the jury’s, not the pilot report’s, and the two initially disagreed — the pilot gave 59 against 7 discordant pairs where the truth is 59 against 1. Two faults, both producing plausible output and raising nothing.</w:t>
+      </w:r>
+    </w:p>
+    <w:p>
+      <w:pPr>
+        <w:pStyle w:val="ListParagraph"/>
+        <w:numPr>
+          <w:ilvl w:val="0"/>
+          <w:numId w:val="2"/>
+        </w:numPr>
+        <w:spacing w:after="70" w:line="272"/>
+      </w:pPr>
+      <w:r>
+        <w:rPr>
+          <w:rFonts w:ascii="Calibri" w:cs="Calibri" w:eastAsia="Calibri" w:hAnsi="Calibri"/>
+          <w:color w:val="1A1A1A"/>
+          <w:sz w:val="20"/>
+          <w:szCs w:val="20"/>
+        </w:rPr>
+        <w:t xml:space="preserve">The pilot matched responses to probes by probe id. Ids are positional, so re-sizing a study reuses them with different applicants behind them; an append-only log outliving a probe set therefore pairs old prompts with answers to new ones. Both stages now match on content hash, as the runner’s cache always did, and report coverage of the probe set explicitly.</w:t>
+      </w:r>
+    </w:p>
+    <w:p>
+      <w:pPr>
+        <w:pStyle w:val="ListParagraph"/>
+        <w:numPr>
+          <w:ilvl w:val="0"/>
+          <w:numId w:val="2"/>
+        </w:numPr>
+        <w:spacing w:after="70" w:line="272"/>
+      </w:pPr>
+      <w:r>
+        <w:rPr>
+          <w:rFonts w:ascii="Calibri" w:cs="Calibri" w:eastAsia="Calibri" w:hAnsi="Calibri"/>
+          <w:color w:val="1A1A1A"/>
+          <w:sz w:val="20"/>
+          <w:szCs w:val="20"/>
+        </w:rPr>
+        <w:t xml:space="preserve">An exact p-value of 1e-16 was reported as exactly zero. Computing the upper tail as 1 minus the cumulative distribution subtracts from 1 a number differing from it by less than float64 can represent. Obtained by symmetry instead, the pooled result is 4.8 x 10⁻²⁷ rather than an implausible 0.</w:t>
+      </w:r>
+    </w:p>
+    <w:p>
+      <w:pPr>
+        <w:spacing w:after="125" w:line="274"/>
+      </w:pPr>
+      <w:r>
+        <w:rPr>
+          <w:rFonts w:ascii="Calibri" w:cs="Calibri" w:eastAsia="Calibri" w:hAnsi="Calibri"/>
+          <w:b/>
+          <w:bCs/>
+          <w:color w:val="1A1A1A"/>
+          <w:sz w:val="21"/>
+          <w:szCs w:val="21"/>
+        </w:rPr>
+        <w:t xml:space="preserve">Neither would have been caught by inspection. </w:t>
+      </w:r>
+      <w:r>
+        <w:rPr>
+          <w:rFonts w:ascii="Calibri" w:cs="Calibri" w:eastAsia="Calibri" w:hAnsi="Calibri"/>
+          <w:color w:val="1A1A1A"/>
+          <w:sz w:val="21"/>
+          <w:szCs w:val="21"/>
+        </w:rPr>
+        <w:t xml:space="preserve">Both surfaced because two independently written implementations of the same quantity disagreed — a redundancy acquired by accident and worth keeping deliberately. It is the same argument the positive controls make, applied to the analysis rather than to the stimulus.</w:t>
+      </w:r>
+    </w:p>
+    <w:p>
+      <w:pPr>
+        <w:pStyle w:val="Heading2"/>
+        <w:spacing w:after="105" w:before="220"/>
+      </w:pPr>
+      <w:r>
+        <w:rPr>
+          <w:rFonts w:ascii="Calibri" w:cs="Calibri" w:eastAsia="Calibri" w:hAnsi="Calibri"/>
+          <w:b/>
+          <w:bCs/>
+          <w:color w:val="8A5A00"/>
+          <w:sz w:val="23"/>
+          <w:szCs w:val="23"/>
+        </w:rPr>
         <w:t xml:space="preserve">Why this was nearly missed — twice</w:t>
       </w:r>
     </w:p>
@@ -8375,7 +8546,7 @@
           <w:sz w:val="21"/>
           <w:szCs w:val="21"/>
         </w:rPr>
-        <w:t xml:space="preserve">At the measured base rate an unpaired two-proportion test on these same 4,740 pairs resolves 2.89 pp. The effect is 1.88 pp. The aggregate approval-gap comparison the study was originally sized for would have returned "no significant difference" on data containing an effect at p = 10⁻²¹. The paired analysis added on 16 August is the entire reason there is a finding.</w:t>
+        <w:t xml:space="preserve">At the measured base rate an unpaired two-proportion test on these same 4,740 pairs resolves 2.89 pp. The effect is 1.96 pp. The aggregate approval-gap comparison the study was originally sized for would have returned "no significant difference" on data containing an effect at p = 10⁻²¹. The paired analysis added on 16 August is the entire reason there is a finding.</w:t>
       </w:r>
     </w:p>
     <w:p>
@@ -9467,6 +9638,7 @@
         <w:tc>
           <w:tcPr>
             <w:tcW w:type="dxa" w:w="1500"/>
+            <w:shd w:fill="EDF5EF" w:color="auto" w:val="clear"/>
             <w:tcMar>
               <w:top w:type="dxa" w:w="80"/>
               <w:left w:type="dxa" w:w="115"/>
@@ -9483,11 +9655,11 @@
                 <w:rFonts w:ascii="Calibri" w:cs="Calibri" w:eastAsia="Calibri" w:hAnsi="Calibri"/>
                 <w:b/>
                 <w:bCs/>
-                <w:color w:val="8A5A00"/>
-                <w:sz w:val="18"/>
-                <w:szCs w:val="18"/>
-              </w:rPr>
-              <w:t xml:space="preserve">To do</w:t>
+                <w:color w:val="1E6B34"/>
+                <w:sz w:val="18"/>
+                <w:szCs w:val="18"/>
+              </w:rPr>
+              <w:t xml:space="preserve">DONE</w:t>
             </w:r>
           </w:p>
         </w:tc>
@@ -9512,7 +9684,7 @@
                 <w:sz w:val="18"/>
                 <w:szCs w:val="18"/>
               </w:rPr>
-              <w:t xml:space="preserve">The finding must come from audited code, not an analysis cell</w:t>
+              <w:t xml:space="preserve">Exact and score intervals; a simulation study validating its own coverage, Type I and power</w:t>
             </w:r>
           </w:p>
         </w:tc>
@@ -12389,7 +12561,7 @@
           <w:sz w:val="17"/>
           <w:szCs w:val="17"/>
         </w:rPr>
-        <w:t xml:space="preserve">184 tests passing  ·  14,825 responses banked on GitHub  ·  probe set e0d72184  ·  checklist fb4c3454  ·  German Credit 1000 records (CC BY 4.0)</w:t>
+        <w:t xml:space="preserve">204 tests passing  ·  14,825 responses banked on GitHub  ·  probe set e0d72184  ·  checklist fb4c3454  ·  German Credit 1000 records (CC BY 4.0)</w:t>
       </w:r>
     </w:p>
     <w:sectPr>

</xml_diff>

<commit_message>
Four-model results in progress log
</commit_message>
<xml_diff>
--- a/docs/GRAIL_weekly_progress.docx
+++ b/docs/GRAIL_weekly_progress.docx
@@ -350,7 +350,7 @@
                 <w:sz w:val="18"/>
                 <w:szCs w:val="18"/>
               </w:rPr>
-              <w:t xml:space="preserve">204 tests · jury built, finding verified</w:t>
+              <w:t xml:space="preserve">210 tests · FOUR MODELS AUDITED</w:t>
             </w:r>
           </w:p>
         </w:tc>
@@ -375,7 +375,7 @@
                 <w:sz w:val="18"/>
                 <w:szCs w:val="18"/>
               </w:rPr>
-              <w:t xml:space="preserve">Second model + planted control re-size</w:t>
+              <w:t xml:space="preserve">Judge harness + annotation study</w:t>
             </w:r>
           </w:p>
         </w:tc>
@@ -449,7 +449,7 @@
           <w:sz w:val="21"/>
           <w:szCs w:val="21"/>
         </w:rPr>
-        <w:t xml:space="preserve">the corrected instrument has produced the project’s first significant finding. Across 4,740 matched pairs the audited model approves female-titled applicants more often than identical male ones — 94 discordant pairs to 1, p = 5 × 10⁻²⁷. The design fault found earlier in the week is why it was found at all: the original sizing could not have detected an effect this size. Roughly 65% of the software, roughly 40% of the empirical evidence.</w:t>
+        <w:t xml:space="preserve">four models across two families have now been through the frozen probe set, and all four favour female-titled applicants over identical male ones. Three are significant; the fourth is underdetermined rather than null. The effect shrinks with model scale, independently in both families. The aggregate ratio test used in fair lending supervision detects none of it. Roughly 70% of the software, roughly 60% of the empirical evidence.</w:t>
       </w:r>
     </w:p>
     <w:p>
@@ -9526,14 +9526,14 @@
                 <w:sz w:val="18"/>
                 <w:szCs w:val="18"/>
               </w:rPr>
-              <w:t xml:space="preserve">Audit the second model end to end</w:t>
+              <w:t xml:space="preserve">Audit further models end to end</w:t>
             </w:r>
           </w:p>
         </w:tc>
         <w:tc>
           <w:tcPr>
             <w:tcW w:type="dxa" w:w="1500"/>
-            <w:shd w:fill="FBEEEE" w:color="auto" w:val="clear"/>
+            <w:shd w:fill="EDF5EF" w:color="auto" w:val="clear"/>
             <w:tcMar>
               <w:top w:type="dxa" w:w="80"/>
               <w:left w:type="dxa" w:w="115"/>
@@ -9550,11 +9550,11 @@
                 <w:rFonts w:ascii="Calibri" w:cs="Calibri" w:eastAsia="Calibri" w:hAnsi="Calibri"/>
                 <w:b/>
                 <w:bCs/>
-                <w:color w:val="9B2C2C"/>
-                <w:sz w:val="18"/>
-                <w:szCs w:val="18"/>
-              </w:rPr>
-              <w:t xml:space="preserve">BLOCKED</w:t>
+                <w:color w:val="1E6B34"/>
+                <w:sz w:val="18"/>
+                <w:szCs w:val="18"/>
+              </w:rPr>
+              <w:t xml:space="preserve">DONE ×4</w:t>
             </w:r>
           </w:p>
         </w:tc>
@@ -9579,7 +9579,7 @@
                 <w:sz w:val="18"/>
                 <w:szCs w:val="18"/>
               </w:rPr>
-              <w:t xml:space="preserve">Not a design problem — the container recycles roughly every 30 minutes</w:t>
+              <w:t xml:space="preserve">61,259 responses over one frozen probe set; each model pushed to GitHub as it completed</w:t>
             </w:r>
           </w:p>
         </w:tc>
@@ -9919,6 +9919,1578 @@
           <w:szCs w:val="21"/>
         </w:rPr>
         <w:t xml:space="preserve">The 17 August finding reproduced through the deterministic jury with its interval; a second model run end to end; and a planted control large enough to have power. No model near any reported number.</w:t>
+      </w:r>
+    </w:p>
+    <w:p>
+      <w:pPr>
+        <w:pStyle w:val="Heading1"/>
+        <w:spacing w:after="145" w:before="290"/>
+      </w:pPr>
+      <w:r>
+        <w:rPr>
+          <w:rFonts w:ascii="Calibri" w:cs="Calibri" w:eastAsia="Calibri" w:hAnsi="Calibri"/>
+          <w:b/>
+          <w:bCs/>
+          <w:color w:val="1A1A1A"/>
+          <w:sz w:val="28"/>
+          <w:szCs w:val="28"/>
+        </w:rPr>
+        <w:t xml:space="preserve">Four models — 1 September</w:t>
+      </w:r>
+    </w:p>
+    <w:p>
+      <w:pPr>
+        <w:spacing w:after="125" w:line="274"/>
+      </w:pPr>
+      <w:r>
+        <w:rPr>
+          <w:rFonts w:ascii="Calibri" w:cs="Calibri" w:eastAsia="Calibri" w:hAnsi="Calibri"/>
+          <w:b/>
+          <w:bCs/>
+          <w:color w:val="1A1A1A"/>
+          <w:sz w:val="21"/>
+          <w:szCs w:val="21"/>
+        </w:rPr>
+        <w:t xml:space="preserve">61,259 responses across four instruction-tuned models and two families, all through one frozen probe set. </w:t>
+      </w:r>
+      <w:r>
+        <w:rPr>
+          <w:rFonts w:ascii="Calibri" w:cs="Calibri" w:eastAsia="Calibri" w:hAnsi="Calibri"/>
+          <w:color w:val="1A1A1A"/>
+          <w:sz w:val="21"/>
+          <w:szCs w:val="21"/>
+        </w:rPr>
+        <w:t xml:space="preserve">Every model was pushed to version control as it completed, so the container recycle that followed the sweep cost nothing — the mechanism built after losing 13,254 responses the same way a fortnight earlier.</w:t>
+      </w:r>
+    </w:p>
+    <w:p>
+      <w:pPr>
+        <w:pStyle w:val="Heading2"/>
+        <w:spacing w:after="105" w:before="220"/>
+      </w:pPr>
+      <w:r>
+        <w:rPr>
+          <w:rFonts w:ascii="Calibri" w:cs="Calibri" w:eastAsia="Calibri" w:hAnsi="Calibri"/>
+          <w:b/>
+          <w:bCs/>
+          <w:color w:val="1E6B34"/>
+          <w:sz w:val="23"/>
+          <w:szCs w:val="23"/>
+        </w:rPr>
+        <w:t xml:space="preserve">All four favour the female-titled applicant</w:t>
+      </w:r>
+    </w:p>
+    <w:tbl>
+      <w:tblPr>
+        <w:tblW w:type="dxa" w:w="9020"/>
+        <w:tblBorders>
+          <w:top w:val="single" w:color="D3D3D3" w:sz="4"/>
+          <w:left w:val="none"/>
+          <w:bottom w:val="single" w:color="D3D3D3" w:sz="4"/>
+          <w:right w:val="none"/>
+          <w:insideH w:val="single" w:color="D3D3D3" w:sz="2"/>
+          <w:insideV w:val="none"/>
+        </w:tblBorders>
+      </w:tblPr>
+      <w:tblGrid>
+        <w:gridCol w:w="2500"/>
+        <w:gridCol w:w="1100"/>
+        <w:gridCol w:w="1700"/>
+        <w:gridCol w:w="1900"/>
+        <w:gridCol w:w="1200"/>
+        <w:gridCol w:w="620"/>
+      </w:tblGrid>
+      <w:tr>
+        <w:trPr>
+          <w:tblHeader/>
+        </w:trPr>
+        <w:tc>
+          <w:tcPr>
+            <w:tcW w:type="dxa" w:w="2500"/>
+            <w:shd w:fill="EEF1F4" w:color="auto" w:val="clear"/>
+            <w:tcMar>
+              <w:top w:type="dxa" w:w="80"/>
+              <w:left w:type="dxa" w:w="115"/>
+              <w:bottom w:type="dxa" w:w="80"/>
+              <w:right w:type="dxa" w:w="115"/>
+            </w:tcMar>
+          </w:tcPr>
+          <w:p>
+            <w:pPr>
+              <w:spacing w:after="0" w:line="252"/>
+            </w:pPr>
+            <w:r>
+              <w:rPr>
+                <w:rFonts w:ascii="Calibri" w:cs="Calibri" w:eastAsia="Calibri" w:hAnsi="Calibri"/>
+                <w:b/>
+                <w:bCs/>
+                <w:color w:val="1A1A1A"/>
+                <w:sz w:val="18"/>
+                <w:szCs w:val="18"/>
+              </w:rPr>
+              <w:t xml:space="preserve">Model</w:t>
+            </w:r>
+          </w:p>
+        </w:tc>
+        <w:tc>
+          <w:tcPr>
+            <w:tcW w:type="dxa" w:w="1100"/>
+            <w:shd w:fill="EEF1F4" w:color="auto" w:val="clear"/>
+            <w:tcMar>
+              <w:top w:type="dxa" w:w="80"/>
+              <w:left w:type="dxa" w:w="115"/>
+              <w:bottom w:type="dxa" w:w="80"/>
+              <w:right w:type="dxa" w:w="115"/>
+            </w:tcMar>
+          </w:tcPr>
+          <w:p>
+            <w:pPr>
+              <w:spacing w:after="0" w:line="252"/>
+            </w:pPr>
+            <w:r>
+              <w:rPr>
+                <w:rFonts w:ascii="Calibri" w:cs="Calibri" w:eastAsia="Calibri" w:hAnsi="Calibri"/>
+                <w:b/>
+                <w:bCs/>
+                <w:color w:val="1A1A1A"/>
+                <w:sz w:val="18"/>
+                <w:szCs w:val="18"/>
+              </w:rPr>
+              <w:t xml:space="preserve">Params</w:t>
+            </w:r>
+          </w:p>
+        </w:tc>
+        <w:tc>
+          <w:tcPr>
+            <w:tcW w:type="dxa" w:w="1700"/>
+            <w:shd w:fill="EEF1F4" w:color="auto" w:val="clear"/>
+            <w:tcMar>
+              <w:top w:type="dxa" w:w="80"/>
+              <w:left w:type="dxa" w:w="115"/>
+              <w:bottom w:type="dxa" w:w="80"/>
+              <w:right w:type="dxa" w:w="115"/>
+            </w:tcMar>
+          </w:tcPr>
+          <w:p>
+            <w:pPr>
+              <w:spacing w:after="0" w:line="252"/>
+            </w:pPr>
+            <w:r>
+              <w:rPr>
+                <w:rFonts w:ascii="Calibri" w:cs="Calibri" w:eastAsia="Calibri" w:hAnsi="Calibri"/>
+                <w:b/>
+                <w:bCs/>
+                <w:color w:val="1A1A1A"/>
+                <w:sz w:val="18"/>
+                <w:szCs w:val="18"/>
+              </w:rPr>
+              <w:t xml:space="preserve">Effect</w:t>
+            </w:r>
+          </w:p>
+        </w:tc>
+        <w:tc>
+          <w:tcPr>
+            <w:tcW w:type="dxa" w:w="1900"/>
+            <w:shd w:fill="EEF1F4" w:color="auto" w:val="clear"/>
+            <w:tcMar>
+              <w:top w:type="dxa" w:w="80"/>
+              <w:left w:type="dxa" w:w="115"/>
+              <w:bottom w:type="dxa" w:w="80"/>
+              <w:right w:type="dxa" w:w="115"/>
+            </w:tcMar>
+          </w:tcPr>
+          <w:p>
+            <w:pPr>
+              <w:spacing w:after="0" w:line="252"/>
+            </w:pPr>
+            <w:r>
+              <w:rPr>
+                <w:rFonts w:ascii="Calibri" w:cs="Calibri" w:eastAsia="Calibri" w:hAnsi="Calibri"/>
+                <w:b/>
+                <w:bCs/>
+                <w:color w:val="1A1A1A"/>
+                <w:sz w:val="18"/>
+                <w:szCs w:val="18"/>
+              </w:rPr>
+              <w:t xml:space="preserve">95% interval</w:t>
+            </w:r>
+          </w:p>
+        </w:tc>
+        <w:tc>
+          <w:tcPr>
+            <w:tcW w:type="dxa" w:w="1200"/>
+            <w:shd w:fill="EEF1F4" w:color="auto" w:val="clear"/>
+            <w:tcMar>
+              <w:top w:type="dxa" w:w="80"/>
+              <w:left w:type="dxa" w:w="115"/>
+              <w:bottom w:type="dxa" w:w="80"/>
+              <w:right w:type="dxa" w:w="115"/>
+            </w:tcMar>
+          </w:tcPr>
+          <w:p>
+            <w:pPr>
+              <w:spacing w:after="0" w:line="252"/>
+            </w:pPr>
+            <w:r>
+              <w:rPr>
+                <w:rFonts w:ascii="Calibri" w:cs="Calibri" w:eastAsia="Calibri" w:hAnsi="Calibri"/>
+                <w:b/>
+                <w:bCs/>
+                <w:color w:val="1A1A1A"/>
+                <w:sz w:val="18"/>
+                <w:szCs w:val="18"/>
+              </w:rPr>
+              <w:t xml:space="preserve">p</w:t>
+            </w:r>
+          </w:p>
+        </w:tc>
+        <w:tc>
+          <w:tcPr>
+            <w:tcW w:type="dxa" w:w="620"/>
+            <w:shd w:fill="EEF1F4" w:color="auto" w:val="clear"/>
+            <w:tcMar>
+              <w:top w:type="dxa" w:w="80"/>
+              <w:left w:type="dxa" w:w="115"/>
+              <w:bottom w:type="dxa" w:w="80"/>
+              <w:right w:type="dxa" w:w="115"/>
+            </w:tcMar>
+          </w:tcPr>
+          <w:p>
+            <w:pPr>
+              <w:spacing w:after="0" w:line="252"/>
+            </w:pPr>
+            <w:r>
+              <w:rPr>
+                <w:rFonts w:ascii="Calibri" w:cs="Calibri" w:eastAsia="Calibri" w:hAnsi="Calibri"/>
+                <w:b/>
+                <w:bCs/>
+                <w:color w:val="1A1A1A"/>
+                <w:sz w:val="18"/>
+                <w:szCs w:val="18"/>
+              </w:rPr>
+              <w:t xml:space="preserve">Controls</w:t>
+            </w:r>
+          </w:p>
+        </w:tc>
+      </w:tr>
+      <w:tr>
+        <w:tc>
+          <w:tcPr>
+            <w:tcW w:type="dxa" w:w="2500"/>
+            <w:tcMar>
+              <w:top w:type="dxa" w:w="80"/>
+              <w:left w:type="dxa" w:w="115"/>
+              <w:bottom w:type="dxa" w:w="80"/>
+              <w:right w:type="dxa" w:w="115"/>
+            </w:tcMar>
+          </w:tcPr>
+          <w:p>
+            <w:pPr>
+              <w:spacing w:after="0" w:line="252"/>
+            </w:pPr>
+            <w:r>
+              <w:rPr>
+                <w:rFonts w:ascii="Calibri" w:cs="Calibri" w:eastAsia="Calibri" w:hAnsi="Calibri"/>
+                <w:color w:val="1A1A1A"/>
+                <w:sz w:val="18"/>
+                <w:szCs w:val="18"/>
+              </w:rPr>
+              <w:t xml:space="preserve">Qwen2.5-7B-Instruct</w:t>
+            </w:r>
+          </w:p>
+        </w:tc>
+        <w:tc>
+          <w:tcPr>
+            <w:tcW w:type="dxa" w:w="1100"/>
+            <w:tcMar>
+              <w:top w:type="dxa" w:w="80"/>
+              <w:left w:type="dxa" w:w="115"/>
+              <w:bottom w:type="dxa" w:w="80"/>
+              <w:right w:type="dxa" w:w="115"/>
+            </w:tcMar>
+          </w:tcPr>
+          <w:p>
+            <w:pPr>
+              <w:spacing w:after="0" w:line="252"/>
+            </w:pPr>
+            <w:r>
+              <w:rPr>
+                <w:rFonts w:ascii="Calibri" w:cs="Calibri" w:eastAsia="Calibri" w:hAnsi="Calibri"/>
+                <w:color w:val="1A1A1A"/>
+                <w:sz w:val="18"/>
+                <w:szCs w:val="18"/>
+              </w:rPr>
+              <w:t xml:space="preserve">7B</w:t>
+            </w:r>
+          </w:p>
+        </w:tc>
+        <w:tc>
+          <w:tcPr>
+            <w:tcW w:type="dxa" w:w="1700"/>
+            <w:tcMar>
+              <w:top w:type="dxa" w:w="80"/>
+              <w:left w:type="dxa" w:w="115"/>
+              <w:bottom w:type="dxa" w:w="80"/>
+              <w:right w:type="dxa" w:w="115"/>
+            </w:tcMar>
+          </w:tcPr>
+          <w:p>
+            <w:pPr>
+              <w:spacing w:after="0" w:line="252"/>
+            </w:pPr>
+            <w:r>
+              <w:rPr>
+                <w:rFonts w:ascii="Calibri" w:cs="Calibri" w:eastAsia="Calibri" w:hAnsi="Calibri"/>
+                <w:b/>
+                <w:bCs/>
+                <w:color w:val="1A1A1A"/>
+                <w:sz w:val="18"/>
+                <w:szCs w:val="18"/>
+              </w:rPr>
+              <w:t xml:space="preserve">+2.04 pp</w:t>
+            </w:r>
+          </w:p>
+        </w:tc>
+        <w:tc>
+          <w:tcPr>
+            <w:tcW w:type="dxa" w:w="1900"/>
+            <w:tcMar>
+              <w:top w:type="dxa" w:w="80"/>
+              <w:left w:type="dxa" w:w="115"/>
+              <w:bottom w:type="dxa" w:w="80"/>
+              <w:right w:type="dxa" w:w="115"/>
+            </w:tcMar>
+          </w:tcPr>
+          <w:p>
+            <w:pPr>
+              <w:spacing w:after="0" w:line="252"/>
+            </w:pPr>
+            <w:r>
+              <w:rPr>
+                <w:rFonts w:ascii="Calibri" w:cs="Calibri" w:eastAsia="Calibri" w:hAnsi="Calibri"/>
+                <w:color w:val="1A1A1A"/>
+                <w:sz w:val="18"/>
+                <w:szCs w:val="18"/>
+              </w:rPr>
+              <w:t xml:space="preserve">+1.55 to +2.61</w:t>
+            </w:r>
+          </w:p>
+        </w:tc>
+        <w:tc>
+          <w:tcPr>
+            <w:tcW w:type="dxa" w:w="1200"/>
+            <w:tcMar>
+              <w:top w:type="dxa" w:w="80"/>
+              <w:left w:type="dxa" w:w="115"/>
+              <w:bottom w:type="dxa" w:w="80"/>
+              <w:right w:type="dxa" w:w="115"/>
+            </w:tcMar>
+          </w:tcPr>
+          <w:p>
+            <w:pPr>
+              <w:spacing w:after="0" w:line="252"/>
+            </w:pPr>
+            <w:r>
+              <w:rPr>
+                <w:rFonts w:ascii="Calibri" w:cs="Calibri" w:eastAsia="Calibri" w:hAnsi="Calibri"/>
+                <w:color w:val="1A1A1A"/>
+                <w:sz w:val="18"/>
+                <w:szCs w:val="18"/>
+              </w:rPr>
+              <w:t xml:space="preserve">1.1 × 10⁻¹⁶</w:t>
+            </w:r>
+          </w:p>
+        </w:tc>
+        <w:tc>
+          <w:tcPr>
+            <w:tcW w:type="dxa" w:w="620"/>
+            <w:tcMar>
+              <w:top w:type="dxa" w:w="80"/>
+              <w:left w:type="dxa" w:w="115"/>
+              <w:bottom w:type="dxa" w:w="80"/>
+              <w:right w:type="dxa" w:w="115"/>
+            </w:tcMar>
+          </w:tcPr>
+          <w:p>
+            <w:pPr>
+              <w:spacing w:after="0" w:line="252"/>
+            </w:pPr>
+            <w:r>
+              <w:rPr>
+                <w:rFonts w:ascii="Calibri" w:cs="Calibri" w:eastAsia="Calibri" w:hAnsi="Calibri"/>
+                <w:color w:val="1A1A1A"/>
+                <w:sz w:val="18"/>
+                <w:szCs w:val="18"/>
+              </w:rPr>
+              <w:t xml:space="preserve">1 / 2</w:t>
+            </w:r>
+          </w:p>
+        </w:tc>
+      </w:tr>
+      <w:tr>
+        <w:tc>
+          <w:tcPr>
+            <w:tcW w:type="dxa" w:w="2500"/>
+            <w:tcMar>
+              <w:top w:type="dxa" w:w="80"/>
+              <w:left w:type="dxa" w:w="115"/>
+              <w:bottom w:type="dxa" w:w="80"/>
+              <w:right w:type="dxa" w:w="115"/>
+            </w:tcMar>
+          </w:tcPr>
+          <w:p>
+            <w:pPr>
+              <w:spacing w:after="0" w:line="252"/>
+            </w:pPr>
+            <w:r>
+              <w:rPr>
+                <w:rFonts w:ascii="Calibri" w:cs="Calibri" w:eastAsia="Calibri" w:hAnsi="Calibri"/>
+                <w:color w:val="1A1A1A"/>
+                <w:sz w:val="18"/>
+                <w:szCs w:val="18"/>
+              </w:rPr>
+              <w:t xml:space="preserve">Llama-3.1-8B-Instruct</w:t>
+            </w:r>
+          </w:p>
+        </w:tc>
+        <w:tc>
+          <w:tcPr>
+            <w:tcW w:type="dxa" w:w="1100"/>
+            <w:tcMar>
+              <w:top w:type="dxa" w:w="80"/>
+              <w:left w:type="dxa" w:w="115"/>
+              <w:bottom w:type="dxa" w:w="80"/>
+              <w:right w:type="dxa" w:w="115"/>
+            </w:tcMar>
+          </w:tcPr>
+          <w:p>
+            <w:pPr>
+              <w:spacing w:after="0" w:line="252"/>
+            </w:pPr>
+            <w:r>
+              <w:rPr>
+                <w:rFonts w:ascii="Calibri" w:cs="Calibri" w:eastAsia="Calibri" w:hAnsi="Calibri"/>
+                <w:color w:val="1A1A1A"/>
+                <w:sz w:val="18"/>
+                <w:szCs w:val="18"/>
+              </w:rPr>
+              <w:t xml:space="preserve">8B</w:t>
+            </w:r>
+          </w:p>
+        </w:tc>
+        <w:tc>
+          <w:tcPr>
+            <w:tcW w:type="dxa" w:w="1700"/>
+            <w:tcMar>
+              <w:top w:type="dxa" w:w="80"/>
+              <w:left w:type="dxa" w:w="115"/>
+              <w:bottom w:type="dxa" w:w="80"/>
+              <w:right w:type="dxa" w:w="115"/>
+            </w:tcMar>
+          </w:tcPr>
+          <w:p>
+            <w:pPr>
+              <w:spacing w:after="0" w:line="252"/>
+            </w:pPr>
+            <w:r>
+              <w:rPr>
+                <w:rFonts w:ascii="Calibri" w:cs="Calibri" w:eastAsia="Calibri" w:hAnsi="Calibri"/>
+                <w:b/>
+                <w:bCs/>
+                <w:color w:val="1A1A1A"/>
+                <w:sz w:val="18"/>
+                <w:szCs w:val="18"/>
+              </w:rPr>
+              <w:t xml:space="preserve">+1.27 pp</w:t>
+            </w:r>
+          </w:p>
+        </w:tc>
+        <w:tc>
+          <w:tcPr>
+            <w:tcW w:type="dxa" w:w="1900"/>
+            <w:tcMar>
+              <w:top w:type="dxa" w:w="80"/>
+              <w:left w:type="dxa" w:w="115"/>
+              <w:bottom w:type="dxa" w:w="80"/>
+              <w:right w:type="dxa" w:w="115"/>
+            </w:tcMar>
+          </w:tcPr>
+          <w:p>
+            <w:pPr>
+              <w:spacing w:after="0" w:line="252"/>
+            </w:pPr>
+            <w:r>
+              <w:rPr>
+                <w:rFonts w:ascii="Calibri" w:cs="Calibri" w:eastAsia="Calibri" w:hAnsi="Calibri"/>
+                <w:color w:val="1A1A1A"/>
+                <w:sz w:val="18"/>
+                <w:szCs w:val="18"/>
+              </w:rPr>
+              <w:t xml:space="preserve">+0.90 to +1.72</w:t>
+            </w:r>
+          </w:p>
+        </w:tc>
+        <w:tc>
+          <w:tcPr>
+            <w:tcW w:type="dxa" w:w="1200"/>
+            <w:tcMar>
+              <w:top w:type="dxa" w:w="80"/>
+              <w:left w:type="dxa" w:w="115"/>
+              <w:bottom w:type="dxa" w:w="80"/>
+              <w:right w:type="dxa" w:w="115"/>
+            </w:tcMar>
+          </w:tcPr>
+          <w:p>
+            <w:pPr>
+              <w:spacing w:after="0" w:line="252"/>
+            </w:pPr>
+            <w:r>
+              <w:rPr>
+                <w:rFonts w:ascii="Calibri" w:cs="Calibri" w:eastAsia="Calibri" w:hAnsi="Calibri"/>
+                <w:color w:val="1A1A1A"/>
+                <w:sz w:val="18"/>
+                <w:szCs w:val="18"/>
+              </w:rPr>
+              <w:t xml:space="preserve">2.9 × 10⁻¹¹</w:t>
+            </w:r>
+          </w:p>
+        </w:tc>
+        <w:tc>
+          <w:tcPr>
+            <w:tcW w:type="dxa" w:w="620"/>
+            <w:tcMar>
+              <w:top w:type="dxa" w:w="80"/>
+              <w:left w:type="dxa" w:w="115"/>
+              <w:bottom w:type="dxa" w:w="80"/>
+              <w:right w:type="dxa" w:w="115"/>
+            </w:tcMar>
+          </w:tcPr>
+          <w:p>
+            <w:pPr>
+              <w:spacing w:after="0" w:line="252"/>
+            </w:pPr>
+            <w:r>
+              <w:rPr>
+                <w:rFonts w:ascii="Calibri" w:cs="Calibri" w:eastAsia="Calibri" w:hAnsi="Calibri"/>
+                <w:color w:val="1A1A1A"/>
+                <w:sz w:val="18"/>
+                <w:szCs w:val="18"/>
+              </w:rPr>
+              <w:t xml:space="preserve">1 / 2</w:t>
+            </w:r>
+          </w:p>
+        </w:tc>
+      </w:tr>
+      <w:tr>
+        <w:tc>
+          <w:tcPr>
+            <w:tcW w:type="dxa" w:w="2500"/>
+            <w:tcMar>
+              <w:top w:type="dxa" w:w="80"/>
+              <w:left w:type="dxa" w:w="115"/>
+              <w:bottom w:type="dxa" w:w="80"/>
+              <w:right w:type="dxa" w:w="115"/>
+            </w:tcMar>
+          </w:tcPr>
+          <w:p>
+            <w:pPr>
+              <w:spacing w:after="0" w:line="252"/>
+            </w:pPr>
+            <w:r>
+              <w:rPr>
+                <w:rFonts w:ascii="Calibri" w:cs="Calibri" w:eastAsia="Calibri" w:hAnsi="Calibri"/>
+                <w:color w:val="1A1A1A"/>
+                <w:sz w:val="18"/>
+                <w:szCs w:val="18"/>
+              </w:rPr>
+              <w:t xml:space="preserve">Qwen2.5-32B-Instruct</w:t>
+            </w:r>
+          </w:p>
+        </w:tc>
+        <w:tc>
+          <w:tcPr>
+            <w:tcW w:type="dxa" w:w="1100"/>
+            <w:tcMar>
+              <w:top w:type="dxa" w:w="80"/>
+              <w:left w:type="dxa" w:w="115"/>
+              <w:bottom w:type="dxa" w:w="80"/>
+              <w:right w:type="dxa" w:w="115"/>
+            </w:tcMar>
+          </w:tcPr>
+          <w:p>
+            <w:pPr>
+              <w:spacing w:after="0" w:line="252"/>
+            </w:pPr>
+            <w:r>
+              <w:rPr>
+                <w:rFonts w:ascii="Calibri" w:cs="Calibri" w:eastAsia="Calibri" w:hAnsi="Calibri"/>
+                <w:color w:val="1A1A1A"/>
+                <w:sz w:val="18"/>
+                <w:szCs w:val="18"/>
+              </w:rPr>
+              <w:t xml:space="preserve">32B</w:t>
+            </w:r>
+          </w:p>
+        </w:tc>
+        <w:tc>
+          <w:tcPr>
+            <w:tcW w:type="dxa" w:w="1700"/>
+            <w:tcMar>
+              <w:top w:type="dxa" w:w="80"/>
+              <w:left w:type="dxa" w:w="115"/>
+              <w:bottom w:type="dxa" w:w="80"/>
+              <w:right w:type="dxa" w:w="115"/>
+            </w:tcMar>
+          </w:tcPr>
+          <w:p>
+            <w:pPr>
+              <w:spacing w:after="0" w:line="252"/>
+            </w:pPr>
+            <w:r>
+              <w:rPr>
+                <w:rFonts w:ascii="Calibri" w:cs="Calibri" w:eastAsia="Calibri" w:hAnsi="Calibri"/>
+                <w:b/>
+                <w:bCs/>
+                <w:color w:val="1A1A1A"/>
+                <w:sz w:val="18"/>
+                <w:szCs w:val="18"/>
+              </w:rPr>
+              <w:t xml:space="preserve">+0.77 pp</w:t>
+            </w:r>
+          </w:p>
+        </w:tc>
+        <w:tc>
+          <w:tcPr>
+            <w:tcW w:type="dxa" w:w="1900"/>
+            <w:tcMar>
+              <w:top w:type="dxa" w:w="80"/>
+              <w:left w:type="dxa" w:w="115"/>
+              <w:bottom w:type="dxa" w:w="80"/>
+              <w:right w:type="dxa" w:w="115"/>
+            </w:tcMar>
+          </w:tcPr>
+          <w:p>
+            <w:pPr>
+              <w:spacing w:after="0" w:line="252"/>
+            </w:pPr>
+            <w:r>
+              <w:rPr>
+                <w:rFonts w:ascii="Calibri" w:cs="Calibri" w:eastAsia="Calibri" w:hAnsi="Calibri"/>
+                <w:color w:val="1A1A1A"/>
+                <w:sz w:val="18"/>
+                <w:szCs w:val="18"/>
+              </w:rPr>
+              <w:t xml:space="preserve">+0.27 to +1.31</w:t>
+            </w:r>
+          </w:p>
+        </w:tc>
+        <w:tc>
+          <w:tcPr>
+            <w:tcW w:type="dxa" w:w="1200"/>
+            <w:tcMar>
+              <w:top w:type="dxa" w:w="80"/>
+              <w:left w:type="dxa" w:w="115"/>
+              <w:bottom w:type="dxa" w:w="80"/>
+              <w:right w:type="dxa" w:w="115"/>
+            </w:tcMar>
+          </w:tcPr>
+          <w:p>
+            <w:pPr>
+              <w:spacing w:after="0" w:line="252"/>
+            </w:pPr>
+            <w:r>
+              <w:rPr>
+                <w:rFonts w:ascii="Calibri" w:cs="Calibri" w:eastAsia="Calibri" w:hAnsi="Calibri"/>
+                <w:color w:val="1A1A1A"/>
+                <w:sz w:val="18"/>
+                <w:szCs w:val="18"/>
+              </w:rPr>
+              <w:t xml:space="preserve">4.6 × 10⁻³</w:t>
+            </w:r>
+          </w:p>
+        </w:tc>
+        <w:tc>
+          <w:tcPr>
+            <w:tcW w:type="dxa" w:w="620"/>
+            <w:tcMar>
+              <w:top w:type="dxa" w:w="80"/>
+              <w:left w:type="dxa" w:w="115"/>
+              <w:bottom w:type="dxa" w:w="80"/>
+              <w:right w:type="dxa" w:w="115"/>
+            </w:tcMar>
+          </w:tcPr>
+          <w:p>
+            <w:pPr>
+              <w:spacing w:after="0" w:line="252"/>
+            </w:pPr>
+            <w:r>
+              <w:rPr>
+                <w:rFonts w:ascii="Calibri" w:cs="Calibri" w:eastAsia="Calibri" w:hAnsi="Calibri"/>
+                <w:b/>
+                <w:bCs/>
+                <w:color w:val="1E6B34"/>
+                <w:sz w:val="18"/>
+                <w:szCs w:val="18"/>
+              </w:rPr>
+              <w:t xml:space="preserve">2 / 2</w:t>
+            </w:r>
+          </w:p>
+        </w:tc>
+      </w:tr>
+      <w:tr>
+        <w:tc>
+          <w:tcPr>
+            <w:tcW w:type="dxa" w:w="2500"/>
+            <w:tcMar>
+              <w:top w:type="dxa" w:w="80"/>
+              <w:left w:type="dxa" w:w="115"/>
+              <w:bottom w:type="dxa" w:w="80"/>
+              <w:right w:type="dxa" w:w="115"/>
+            </w:tcMar>
+          </w:tcPr>
+          <w:p>
+            <w:pPr>
+              <w:spacing w:after="0" w:line="252"/>
+            </w:pPr>
+            <w:r>
+              <w:rPr>
+                <w:rFonts w:ascii="Calibri" w:cs="Calibri" w:eastAsia="Calibri" w:hAnsi="Calibri"/>
+                <w:color w:val="1A1A1A"/>
+                <w:sz w:val="18"/>
+                <w:szCs w:val="18"/>
+              </w:rPr>
+              <w:t xml:space="preserve">Llama-3.1-70B-Instruct</w:t>
+            </w:r>
+          </w:p>
+        </w:tc>
+        <w:tc>
+          <w:tcPr>
+            <w:tcW w:type="dxa" w:w="1100"/>
+            <w:tcMar>
+              <w:top w:type="dxa" w:w="80"/>
+              <w:left w:type="dxa" w:w="115"/>
+              <w:bottom w:type="dxa" w:w="80"/>
+              <w:right w:type="dxa" w:w="115"/>
+            </w:tcMar>
+          </w:tcPr>
+          <w:p>
+            <w:pPr>
+              <w:spacing w:after="0" w:line="252"/>
+            </w:pPr>
+            <w:r>
+              <w:rPr>
+                <w:rFonts w:ascii="Calibri" w:cs="Calibri" w:eastAsia="Calibri" w:hAnsi="Calibri"/>
+                <w:color w:val="1A1A1A"/>
+                <w:sz w:val="18"/>
+                <w:szCs w:val="18"/>
+              </w:rPr>
+              <w:t xml:space="preserve">70B</w:t>
+            </w:r>
+          </w:p>
+        </w:tc>
+        <w:tc>
+          <w:tcPr>
+            <w:tcW w:type="dxa" w:w="1700"/>
+            <w:tcMar>
+              <w:top w:type="dxa" w:w="80"/>
+              <w:left w:type="dxa" w:w="115"/>
+              <w:bottom w:type="dxa" w:w="80"/>
+              <w:right w:type="dxa" w:w="115"/>
+            </w:tcMar>
+          </w:tcPr>
+          <w:p>
+            <w:pPr>
+              <w:spacing w:after="0" w:line="252"/>
+            </w:pPr>
+            <w:r>
+              <w:rPr>
+                <w:rFonts w:ascii="Calibri" w:cs="Calibri" w:eastAsia="Calibri" w:hAnsi="Calibri"/>
+                <w:color w:val="1A1A1A"/>
+                <w:sz w:val="18"/>
+                <w:szCs w:val="18"/>
+              </w:rPr>
+              <w:t xml:space="preserve">+0.18 pp</w:t>
+            </w:r>
+          </w:p>
+        </w:tc>
+        <w:tc>
+          <w:tcPr>
+            <w:tcW w:type="dxa" w:w="1900"/>
+            <w:tcMar>
+              <w:top w:type="dxa" w:w="80"/>
+              <w:left w:type="dxa" w:w="115"/>
+              <w:bottom w:type="dxa" w:w="80"/>
+              <w:right w:type="dxa" w:w="115"/>
+            </w:tcMar>
+          </w:tcPr>
+          <w:p>
+            <w:pPr>
+              <w:spacing w:after="0" w:line="252"/>
+            </w:pPr>
+            <w:r>
+              <w:rPr>
+                <w:rFonts w:ascii="Calibri" w:cs="Calibri" w:eastAsia="Calibri" w:hAnsi="Calibri"/>
+                <w:color w:val="1A1A1A"/>
+                <w:sz w:val="18"/>
+                <w:szCs w:val="18"/>
+              </w:rPr>
+              <w:t xml:space="preserve">+0.05 to +0.38</w:t>
+            </w:r>
+          </w:p>
+        </w:tc>
+        <w:tc>
+          <w:tcPr>
+            <w:tcW w:type="dxa" w:w="1200"/>
+            <w:tcMar>
+              <w:top w:type="dxa" w:w="80"/>
+              <w:left w:type="dxa" w:w="115"/>
+              <w:bottom w:type="dxa" w:w="80"/>
+              <w:right w:type="dxa" w:w="115"/>
+            </w:tcMar>
+          </w:tcPr>
+          <w:p>
+            <w:pPr>
+              <w:spacing w:after="0" w:line="252"/>
+            </w:pPr>
+            <w:r>
+              <w:rPr>
+                <w:rFonts w:ascii="Calibri" w:cs="Calibri" w:eastAsia="Calibri" w:hAnsi="Calibri"/>
+                <w:color w:val="8A5A00"/>
+                <w:sz w:val="18"/>
+                <w:szCs w:val="18"/>
+              </w:rPr>
+              <w:t xml:space="preserve">6.3 × 10⁻² †</w:t>
+            </w:r>
+          </w:p>
+        </w:tc>
+        <w:tc>
+          <w:tcPr>
+            <w:tcW w:type="dxa" w:w="620"/>
+            <w:tcMar>
+              <w:top w:type="dxa" w:w="80"/>
+              <w:left w:type="dxa" w:w="115"/>
+              <w:bottom w:type="dxa" w:w="80"/>
+              <w:right w:type="dxa" w:w="115"/>
+            </w:tcMar>
+          </w:tcPr>
+          <w:p>
+            <w:pPr>
+              <w:spacing w:after="0" w:line="252"/>
+            </w:pPr>
+            <w:r>
+              <w:rPr>
+                <w:rFonts w:ascii="Calibri" w:cs="Calibri" w:eastAsia="Calibri" w:hAnsi="Calibri"/>
+                <w:b/>
+                <w:bCs/>
+                <w:color w:val="1E6B34"/>
+                <w:sz w:val="18"/>
+                <w:szCs w:val="18"/>
+              </w:rPr>
+              <w:t xml:space="preserve">2 / 2</w:t>
+            </w:r>
+          </w:p>
+        </w:tc>
+      </w:tr>
+    </w:tbl>
+    <w:p>
+      <w:pPr>
+        <w:spacing w:after="125" w:line="274"/>
+      </w:pPr>
+      <w:r>
+        <w:rPr>
+          <w:rFonts w:ascii="Calibri" w:cs="Calibri" w:eastAsia="Calibri" w:hAnsi="Calibri"/>
+          <w:color w:val="5F6368"/>
+          <w:sz w:val="19"/>
+          <w:szCs w:val="19"/>
+        </w:rPr>
+        <w:t xml:space="preserve">† Underdetermined rather than null: five discordant pairs, below the floor of six at which an exact sign test can reject at all. Resolving the 70B’s direction would need roughly 16,500 pairs against the 2,844 committed — a separate study, not a re-run.</w:t>
+      </w:r>
+    </w:p>
+    <w:p>
+      <w:pPr>
+        <w:pStyle w:val="Heading2"/>
+        <w:spacing w:after="105" w:before="220"/>
+      </w:pPr>
+      <w:r>
+        <w:rPr>
+          <w:rFonts w:ascii="Calibri" w:cs="Calibri" w:eastAsia="Calibri" w:hAnsi="Calibri"/>
+          <w:b/>
+          <w:bCs/>
+          <w:color w:val="1E6B34"/>
+          <w:sz w:val="23"/>
+          <w:szCs w:val="23"/>
+        </w:rPr>
+        <w:t xml:space="preserve">The effect shrinks with scale — in both families independently</w:t>
+      </w:r>
+    </w:p>
+    <w:tbl>
+      <w:tblPr>
+        <w:tblW w:type="dxa" w:w="9020"/>
+        <w:tblBorders>
+          <w:top w:val="single" w:color="D3D3D3" w:sz="4"/>
+          <w:left w:val="none"/>
+          <w:bottom w:val="single" w:color="D3D3D3" w:sz="4"/>
+          <w:right w:val="none"/>
+          <w:insideH w:val="single" w:color="D3D3D3" w:sz="2"/>
+          <w:insideV w:val="none"/>
+        </w:tblBorders>
+      </w:tblPr>
+      <w:tblGrid>
+        <w:gridCol w:w="3000"/>
+        <w:gridCol w:w="3000"/>
+        <w:gridCol w:w="3020"/>
+      </w:tblGrid>
+      <w:tr>
+        <w:trPr>
+          <w:tblHeader/>
+        </w:trPr>
+        <w:tc>
+          <w:tcPr>
+            <w:tcW w:type="dxa" w:w="3000"/>
+            <w:shd w:fill="EEF1F4" w:color="auto" w:val="clear"/>
+            <w:tcMar>
+              <w:top w:type="dxa" w:w="80"/>
+              <w:left w:type="dxa" w:w="115"/>
+              <w:bottom w:type="dxa" w:w="80"/>
+              <w:right w:type="dxa" w:w="115"/>
+            </w:tcMar>
+          </w:tcPr>
+          <w:p>
+            <w:pPr>
+              <w:spacing w:after="0" w:line="252"/>
+            </w:pPr>
+            <w:r>
+              <w:rPr>
+                <w:rFonts w:ascii="Calibri" w:cs="Calibri" w:eastAsia="Calibri" w:hAnsi="Calibri"/>
+                <w:b/>
+                <w:bCs/>
+                <w:color w:val="1A1A1A"/>
+                <w:sz w:val="18"/>
+                <w:szCs w:val="18"/>
+              </w:rPr>
+              <w:t xml:space="preserve">Family</w:t>
+            </w:r>
+          </w:p>
+        </w:tc>
+        <w:tc>
+          <w:tcPr>
+            <w:tcW w:type="dxa" w:w="3000"/>
+            <w:shd w:fill="EEF1F4" w:color="auto" w:val="clear"/>
+            <w:tcMar>
+              <w:top w:type="dxa" w:w="80"/>
+              <w:left w:type="dxa" w:w="115"/>
+              <w:bottom w:type="dxa" w:w="80"/>
+              <w:right w:type="dxa" w:w="115"/>
+            </w:tcMar>
+          </w:tcPr>
+          <w:p>
+            <w:pPr>
+              <w:spacing w:after="0" w:line="252"/>
+            </w:pPr>
+            <w:r>
+              <w:rPr>
+                <w:rFonts w:ascii="Calibri" w:cs="Calibri" w:eastAsia="Calibri" w:hAnsi="Calibri"/>
+                <w:b/>
+                <w:bCs/>
+                <w:color w:val="1A1A1A"/>
+                <w:sz w:val="18"/>
+                <w:szCs w:val="18"/>
+              </w:rPr>
+              <w:t xml:space="preserve">Change</w:t>
+            </w:r>
+          </w:p>
+        </w:tc>
+        <w:tc>
+          <w:tcPr>
+            <w:tcW w:type="dxa" w:w="3020"/>
+            <w:shd w:fill="EEF1F4" w:color="auto" w:val="clear"/>
+            <w:tcMar>
+              <w:top w:type="dxa" w:w="80"/>
+              <w:left w:type="dxa" w:w="115"/>
+              <w:bottom w:type="dxa" w:w="80"/>
+              <w:right w:type="dxa" w:w="115"/>
+            </w:tcMar>
+          </w:tcPr>
+          <w:p>
+            <w:pPr>
+              <w:spacing w:after="0" w:line="252"/>
+            </w:pPr>
+            <w:r>
+              <w:rPr>
+                <w:rFonts w:ascii="Calibri" w:cs="Calibri" w:eastAsia="Calibri" w:hAnsi="Calibri"/>
+                <w:b/>
+                <w:bCs/>
+                <w:color w:val="1A1A1A"/>
+                <w:sz w:val="18"/>
+                <w:szCs w:val="18"/>
+              </w:rPr>
+              <w:t xml:space="preserve">Factor</w:t>
+            </w:r>
+          </w:p>
+        </w:tc>
+      </w:tr>
+      <w:tr>
+        <w:tc>
+          <w:tcPr>
+            <w:tcW w:type="dxa" w:w="3000"/>
+            <w:tcMar>
+              <w:top w:type="dxa" w:w="80"/>
+              <w:left w:type="dxa" w:w="115"/>
+              <w:bottom w:type="dxa" w:w="80"/>
+              <w:right w:type="dxa" w:w="115"/>
+            </w:tcMar>
+          </w:tcPr>
+          <w:p>
+            <w:pPr>
+              <w:spacing w:after="0" w:line="252"/>
+            </w:pPr>
+            <w:r>
+              <w:rPr>
+                <w:rFonts w:ascii="Calibri" w:cs="Calibri" w:eastAsia="Calibri" w:hAnsi="Calibri"/>
+                <w:color w:val="1A1A1A"/>
+                <w:sz w:val="18"/>
+                <w:szCs w:val="18"/>
+              </w:rPr>
+              <w:t xml:space="preserve">Qwen</w:t>
+            </w:r>
+          </w:p>
+        </w:tc>
+        <w:tc>
+          <w:tcPr>
+            <w:tcW w:type="dxa" w:w="3000"/>
+            <w:tcMar>
+              <w:top w:type="dxa" w:w="80"/>
+              <w:left w:type="dxa" w:w="115"/>
+              <w:bottom w:type="dxa" w:w="80"/>
+              <w:right w:type="dxa" w:w="115"/>
+            </w:tcMar>
+          </w:tcPr>
+          <w:p>
+            <w:pPr>
+              <w:spacing w:after="0" w:line="252"/>
+            </w:pPr>
+            <w:r>
+              <w:rPr>
+                <w:rFonts w:ascii="Calibri" w:cs="Calibri" w:eastAsia="Calibri" w:hAnsi="Calibri"/>
+                <w:color w:val="1A1A1A"/>
+                <w:sz w:val="18"/>
+                <w:szCs w:val="18"/>
+              </w:rPr>
+              <w:t xml:space="preserve">7B → 32B:  2.04 pp → 0.77 pp</w:t>
+            </w:r>
+          </w:p>
+        </w:tc>
+        <w:tc>
+          <w:tcPr>
+            <w:tcW w:type="dxa" w:w="3020"/>
+            <w:tcMar>
+              <w:top w:type="dxa" w:w="80"/>
+              <w:left w:type="dxa" w:w="115"/>
+              <w:bottom w:type="dxa" w:w="80"/>
+              <w:right w:type="dxa" w:w="115"/>
+            </w:tcMar>
+          </w:tcPr>
+          <w:p>
+            <w:pPr>
+              <w:spacing w:after="0" w:line="252"/>
+            </w:pPr>
+            <w:r>
+              <w:rPr>
+                <w:rFonts w:ascii="Calibri" w:cs="Calibri" w:eastAsia="Calibri" w:hAnsi="Calibri"/>
+                <w:color w:val="1A1A1A"/>
+                <w:sz w:val="18"/>
+                <w:szCs w:val="18"/>
+              </w:rPr>
+              <w:t xml:space="preserve">2.6× smaller</w:t>
+            </w:r>
+          </w:p>
+        </w:tc>
+      </w:tr>
+      <w:tr>
+        <w:tc>
+          <w:tcPr>
+            <w:tcW w:type="dxa" w:w="3000"/>
+            <w:tcMar>
+              <w:top w:type="dxa" w:w="80"/>
+              <w:left w:type="dxa" w:w="115"/>
+              <w:bottom w:type="dxa" w:w="80"/>
+              <w:right w:type="dxa" w:w="115"/>
+            </w:tcMar>
+          </w:tcPr>
+          <w:p>
+            <w:pPr>
+              <w:spacing w:after="0" w:line="252"/>
+            </w:pPr>
+            <w:r>
+              <w:rPr>
+                <w:rFonts w:ascii="Calibri" w:cs="Calibri" w:eastAsia="Calibri" w:hAnsi="Calibri"/>
+                <w:color w:val="1A1A1A"/>
+                <w:sz w:val="18"/>
+                <w:szCs w:val="18"/>
+              </w:rPr>
+              <w:t xml:space="preserve">Llama</w:t>
+            </w:r>
+          </w:p>
+        </w:tc>
+        <w:tc>
+          <w:tcPr>
+            <w:tcW w:type="dxa" w:w="3000"/>
+            <w:tcMar>
+              <w:top w:type="dxa" w:w="80"/>
+              <w:left w:type="dxa" w:w="115"/>
+              <w:bottom w:type="dxa" w:w="80"/>
+              <w:right w:type="dxa" w:w="115"/>
+            </w:tcMar>
+          </w:tcPr>
+          <w:p>
+            <w:pPr>
+              <w:spacing w:after="0" w:line="252"/>
+            </w:pPr>
+            <w:r>
+              <w:rPr>
+                <w:rFonts w:ascii="Calibri" w:cs="Calibri" w:eastAsia="Calibri" w:hAnsi="Calibri"/>
+                <w:color w:val="1A1A1A"/>
+                <w:sz w:val="18"/>
+                <w:szCs w:val="18"/>
+              </w:rPr>
+              <w:t xml:space="preserve">8B → 70B:  1.27 pp → 0.18 pp</w:t>
+            </w:r>
+          </w:p>
+        </w:tc>
+        <w:tc>
+          <w:tcPr>
+            <w:tcW w:type="dxa" w:w="3020"/>
+            <w:tcMar>
+              <w:top w:type="dxa" w:w="80"/>
+              <w:left w:type="dxa" w:w="115"/>
+              <w:bottom w:type="dxa" w:w="80"/>
+              <w:right w:type="dxa" w:w="115"/>
+            </w:tcMar>
+          </w:tcPr>
+          <w:p>
+            <w:pPr>
+              <w:spacing w:after="0" w:line="252"/>
+            </w:pPr>
+            <w:r>
+              <w:rPr>
+                <w:rFonts w:ascii="Calibri" w:cs="Calibri" w:eastAsia="Calibri" w:hAnsi="Calibri"/>
+                <w:color w:val="1A1A1A"/>
+                <w:sz w:val="18"/>
+                <w:szCs w:val="18"/>
+              </w:rPr>
+              <w:t xml:space="preserve">7.1× smaller</w:t>
+            </w:r>
+          </w:p>
+        </w:tc>
+      </w:tr>
+    </w:tbl>
+    <w:p>
+      <w:pPr>
+        <w:spacing w:after="125" w:line="274"/>
+      </w:pPr>
+      <w:r>
+        <w:rPr>
+          <w:rFonts w:ascii="Calibri" w:cs="Calibri" w:eastAsia="Calibri" w:hAnsi="Calibri"/>
+          <w:color w:val="1A1A1A"/>
+          <w:sz w:val="20"/>
+          <w:szCs w:val="20"/>
+        </w:rPr>
+        <w:t xml:space="preserve">Two lineages, two laboratories, the same monotone relationship. Four points is suggestive rather than established, and it is reported as such — but the two within-family comparisons are independent of one another, which is more than a single trend line through four dots.</w:t>
+      </w:r>
+    </w:p>
+    <w:p>
+      <w:pPr>
+        <w:pStyle w:val="Heading2"/>
+        <w:spacing w:after="105" w:before="220"/>
+      </w:pPr>
+      <w:r>
+        <w:rPr>
+          <w:rFonts w:ascii="Calibri" w:cs="Calibri" w:eastAsia="Calibri" w:hAnsi="Calibri"/>
+          <w:b/>
+          <w:bCs/>
+          <w:color w:val="8A5A00"/>
+          <w:sz w:val="23"/>
+          <w:szCs w:val="23"/>
+        </w:rPr>
+        <w:t xml:space="preserve">The control pattern is a finding in its own right</w:t>
+      </w:r>
+    </w:p>
+    <w:p>
+      <w:pPr>
+        <w:spacing w:after="125" w:line="274"/>
+      </w:pPr>
+      <w:r>
+        <w:rPr>
+          <w:rFonts w:ascii="Calibri" w:cs="Calibri" w:eastAsia="Calibri" w:hAnsi="Calibri"/>
+          <w:color w:val="1A1A1A"/>
+          <w:sz w:val="21"/>
+          <w:szCs w:val="21"/>
+        </w:rPr>
+        <w:t xml:space="preserve">The planted-axis control instructs the model, in a policy note, to hold female-titled applications to a stricter threshold. It fired for the two LARGE models and not for the two small ones. The larger models therefore follow an explicit instruction to weight gender while exhibiting less implicit gender effect; the smaller models ignore the instruction while exhibiting more.</w:t>
+      </w:r>
+    </w:p>
+    <w:p>
+      <w:pPr>
+        <w:spacing w:after="125" w:line="274"/>
+      </w:pPr>
+      <w:r>
+        <w:rPr>
+          <w:rFonts w:ascii="Calibri" w:cs="Calibri" w:eastAsia="Calibri" w:hAnsi="Calibri"/>
+          <w:b/>
+          <w:bCs/>
+          <w:color w:val="1A1A1A"/>
+          <w:sz w:val="21"/>
+          <w:szCs w:val="21"/>
+        </w:rPr>
+        <w:t xml:space="preserve">This also closes the interpretability problem that opened the fortnight. </w:t>
+      </w:r>
+      <w:r>
+        <w:rPr>
+          <w:rFonts w:ascii="Calibri" w:cs="Calibri" w:eastAsia="Calibri" w:hAnsi="Calibri"/>
+          <w:color w:val="1A1A1A"/>
+          <w:sz w:val="21"/>
+          <w:szCs w:val="21"/>
+        </w:rPr>
+        <w:t xml:space="preserve">Sensitivity on the protected axis is now established for every audited model by one route or the other — the small models through their own significant effects, the large ones through the control firing. No result here rests on an instrument that was never shown able to detect anything.</w:t>
+      </w:r>
+    </w:p>
+    <w:p>
+      <w:pPr>
+        <w:pStyle w:val="Heading2"/>
+        <w:spacing w:after="105" w:before="220"/>
+      </w:pPr>
+      <w:r>
+        <w:rPr>
+          <w:rFonts w:ascii="Calibri" w:cs="Calibri" w:eastAsia="Calibri" w:hAnsi="Calibri"/>
+          <w:b/>
+          <w:bCs/>
+          <w:color w:val="9B2C2C"/>
+          <w:sz w:val="23"/>
+          <w:szCs w:val="23"/>
+        </w:rPr>
+        <w:t xml:space="preserve">The supervisory test clears all four</w:t>
+      </w:r>
+    </w:p>
+    <w:p>
+      <w:pPr>
+        <w:spacing w:after="125" w:line="274"/>
+      </w:pPr>
+      <w:r>
+        <w:rPr>
+          <w:rFonts w:ascii="Calibri" w:cs="Calibri" w:eastAsia="Calibri" w:hAnsi="Calibri"/>
+          <w:color w:val="1A1A1A"/>
+          <w:sz w:val="20"/>
+          <w:szCs w:val="20"/>
+        </w:rPr>
+        <w:t xml:space="preserve">Every adverse impact ratio sits at or near the four-fifths band while three of the four models show significant differential treatment of identical applicants. This is no longer a single model slipping past a screening rule: it is the ratio test used in fair lending supervision failing to detect an effect present in every system tested. Aggregating over applicants destroys the pairing that carries the signal, and no threshold on the aggregate recovers it.</w:t>
+      </w:r>
+    </w:p>
+    <w:p>
+      <w:pPr>
+        <w:pStyle w:val="Heading2"/>
+        <w:spacing w:after="105" w:before="220"/>
+      </w:pPr>
+      <w:r>
+        <w:rPr>
+          <w:rFonts w:ascii="Calibri" w:cs="Calibri" w:eastAsia="Calibri" w:hAnsi="Calibri"/>
+          <w:b/>
+          <w:bCs/>
+          <w:color w:val="8A5A00"/>
+          <w:sz w:val="23"/>
+          <w:szCs w:val="23"/>
+        </w:rPr>
+        <w:t xml:space="preserve">What can and cannot be claimed</w:t>
+      </w:r>
+    </w:p>
+    <w:tbl>
+      <w:tblPr>
+        <w:tblW w:type="dxa" w:w="9020"/>
+        <w:tblBorders>
+          <w:top w:val="single" w:color="D3D3D3" w:sz="4"/>
+          <w:left w:val="none"/>
+          <w:bottom w:val="single" w:color="D3D3D3" w:sz="4"/>
+          <w:right w:val="none"/>
+          <w:insideH w:val="single" w:color="D3D3D3" w:sz="2"/>
+          <w:insideV w:val="none"/>
+        </w:tblBorders>
+      </w:tblPr>
+      <w:tblGrid>
+        <w:gridCol w:w="4200"/>
+        <w:gridCol w:w="4820"/>
+      </w:tblGrid>
+      <w:tr>
+        <w:trPr>
+          <w:tblHeader/>
+        </w:trPr>
+        <w:tc>
+          <w:tcPr>
+            <w:tcW w:type="dxa" w:w="4200"/>
+            <w:shd w:fill="EEF1F4" w:color="auto" w:val="clear"/>
+            <w:tcMar>
+              <w:top w:type="dxa" w:w="80"/>
+              <w:left w:type="dxa" w:w="115"/>
+              <w:bottom w:type="dxa" w:w="80"/>
+              <w:right w:type="dxa" w:w="115"/>
+            </w:tcMar>
+          </w:tcPr>
+          <w:p>
+            <w:pPr>
+              <w:spacing w:after="0" w:line="252"/>
+            </w:pPr>
+            <w:r>
+              <w:rPr>
+                <w:rFonts w:ascii="Calibri" w:cs="Calibri" w:eastAsia="Calibri" w:hAnsi="Calibri"/>
+                <w:b/>
+                <w:bCs/>
+                <w:color w:val="1A1A1A"/>
+                <w:sz w:val="18"/>
+                <w:szCs w:val="18"/>
+              </w:rPr>
+              <w:t xml:space="preserve">Supported</w:t>
+            </w:r>
+          </w:p>
+        </w:tc>
+        <w:tc>
+          <w:tcPr>
+            <w:tcW w:type="dxa" w:w="4820"/>
+            <w:shd w:fill="EEF1F4" w:color="auto" w:val="clear"/>
+            <w:tcMar>
+              <w:top w:type="dxa" w:w="80"/>
+              <w:left w:type="dxa" w:w="115"/>
+              <w:bottom w:type="dxa" w:w="80"/>
+              <w:right w:type="dxa" w:w="115"/>
+            </w:tcMar>
+          </w:tcPr>
+          <w:p>
+            <w:pPr>
+              <w:spacing w:after="0" w:line="252"/>
+            </w:pPr>
+            <w:r>
+              <w:rPr>
+                <w:rFonts w:ascii="Calibri" w:cs="Calibri" w:eastAsia="Calibri" w:hAnsi="Calibri"/>
+                <w:b/>
+                <w:bCs/>
+                <w:color w:val="1A1A1A"/>
+                <w:sz w:val="18"/>
+                <w:szCs w:val="18"/>
+              </w:rPr>
+              <w:t xml:space="preserve">Not yet supported</w:t>
+            </w:r>
+          </w:p>
+        </w:tc>
+      </w:tr>
+      <w:tr>
+        <w:tc>
+          <w:tcPr>
+            <w:tcW w:type="dxa" w:w="4200"/>
+            <w:tcMar>
+              <w:top w:type="dxa" w:w="80"/>
+              <w:left w:type="dxa" w:w="115"/>
+              <w:bottom w:type="dxa" w:w="80"/>
+              <w:right w:type="dxa" w:w="115"/>
+            </w:tcMar>
+          </w:tcPr>
+          <w:p>
+            <w:pPr>
+              <w:spacing w:after="0" w:line="252"/>
+            </w:pPr>
+            <w:r>
+              <w:rPr>
+                <w:rFonts w:ascii="Calibri" w:cs="Calibri" w:eastAsia="Calibri" w:hAnsi="Calibri"/>
+                <w:color w:val="1A1A1A"/>
+                <w:sz w:val="18"/>
+                <w:szCs w:val="18"/>
+              </w:rPr>
+              <w:t xml:space="preserve">Four instruction-tuned models across two families approve female-titled applicants more often than identical male ones on German Credit applications rendered by this template</w:t>
+            </w:r>
+          </w:p>
+        </w:tc>
+        <w:tc>
+          <w:tcPr>
+            <w:tcW w:type="dxa" w:w="4820"/>
+            <w:tcMar>
+              <w:top w:type="dxa" w:w="80"/>
+              <w:left w:type="dxa" w:w="115"/>
+              <w:bottom w:type="dxa" w:w="80"/>
+              <w:right w:type="dxa" w:w="115"/>
+            </w:tcMar>
+          </w:tcPr>
+          <w:p>
+            <w:pPr>
+              <w:spacing w:after="0" w:line="252"/>
+            </w:pPr>
+            <w:r>
+              <w:rPr>
+                <w:rFonts w:ascii="Calibri" w:cs="Calibri" w:eastAsia="Calibri" w:hAnsi="Calibri"/>
+                <w:color w:val="1A1A1A"/>
+                <w:sz w:val="18"/>
+                <w:szCs w:val="18"/>
+              </w:rPr>
+              <w:t xml:space="preserve">That this survives a different prompt serialization — Week 9 tests it directly</w:t>
+            </w:r>
+          </w:p>
+        </w:tc>
+      </w:tr>
+      <w:tr>
+        <w:tc>
+          <w:tcPr>
+            <w:tcW w:type="dxa" w:w="4200"/>
+            <w:tcMar>
+              <w:top w:type="dxa" w:w="80"/>
+              <w:left w:type="dxa" w:w="115"/>
+              <w:bottom w:type="dxa" w:w="80"/>
+              <w:right w:type="dxa" w:w="115"/>
+            </w:tcMar>
+          </w:tcPr>
+          <w:p>
+            <w:pPr>
+              <w:spacing w:after="0" w:line="252"/>
+            </w:pPr>
+            <w:r>
+              <w:rPr>
+                <w:rFonts w:ascii="Calibri" w:cs="Calibri" w:eastAsia="Calibri" w:hAnsi="Calibri"/>
+                <w:color w:val="1A1A1A"/>
+                <w:sz w:val="18"/>
+                <w:szCs w:val="18"/>
+              </w:rPr>
+              <w:t xml:space="preserve">The effect is largest in the smallest models, monotonically within each family</w:t>
+            </w:r>
+          </w:p>
+        </w:tc>
+        <w:tc>
+          <w:tcPr>
+            <w:tcW w:type="dxa" w:w="4820"/>
+            <w:tcMar>
+              <w:top w:type="dxa" w:w="80"/>
+              <w:left w:type="dxa" w:w="115"/>
+              <w:bottom w:type="dxa" w:w="80"/>
+              <w:right w:type="dxa" w:w="115"/>
+            </w:tcMar>
+          </w:tcPr>
+          <w:p>
+            <w:pPr>
+              <w:spacing w:after="0" w:line="252"/>
+            </w:pPr>
+            <w:r>
+              <w:rPr>
+                <w:rFonts w:ascii="Calibri" w:cs="Calibri" w:eastAsia="Calibri" w:hAnsi="Calibri"/>
+                <w:color w:val="1A1A1A"/>
+                <w:sz w:val="18"/>
+                <w:szCs w:val="18"/>
+              </w:rPr>
+              <w:t xml:space="preserve">That the scale relationship holds beyond four observations</w:t>
+            </w:r>
+          </w:p>
+        </w:tc>
+      </w:tr>
+      <w:tr>
+        <w:tc>
+          <w:tcPr>
+            <w:tcW w:type="dxa" w:w="4200"/>
+            <w:tcMar>
+              <w:top w:type="dxa" w:w="80"/>
+              <w:left w:type="dxa" w:w="115"/>
+              <w:bottom w:type="dxa" w:w="80"/>
+              <w:right w:type="dxa" w:w="115"/>
+            </w:tcMar>
+          </w:tcPr>
+          <w:p>
+            <w:pPr>
+              <w:spacing w:after="0" w:line="252"/>
+            </w:pPr>
+            <w:r>
+              <w:rPr>
+                <w:rFonts w:ascii="Calibri" w:cs="Calibri" w:eastAsia="Calibri" w:hAnsi="Calibri"/>
+                <w:color w:val="1A1A1A"/>
+                <w:sz w:val="18"/>
+                <w:szCs w:val="18"/>
+              </w:rPr>
+              <w:t xml:space="preserve">The aggregate ratio test detects none of it</w:t>
+            </w:r>
+          </w:p>
+        </w:tc>
+        <w:tc>
+          <w:tcPr>
+            <w:tcW w:type="dxa" w:w="4820"/>
+            <w:tcMar>
+              <w:top w:type="dxa" w:w="80"/>
+              <w:left w:type="dxa" w:w="115"/>
+              <w:bottom w:type="dxa" w:w="80"/>
+              <w:right w:type="dxa" w:w="115"/>
+            </w:tcMar>
+          </w:tcPr>
+          <w:p>
+            <w:pPr>
+              <w:spacing w:after="0" w:line="252"/>
+            </w:pPr>
+            <w:r>
+              <w:rPr>
+                <w:rFonts w:ascii="Calibri" w:cs="Calibri" w:eastAsia="Calibri" w:hAnsi="Calibri"/>
+                <w:color w:val="1A1A1A"/>
+                <w:sz w:val="18"/>
+                <w:szCs w:val="18"/>
+              </w:rPr>
+              <w:t xml:space="preserve">Any statement about the 70B’s direction</w:t>
+            </w:r>
+          </w:p>
+        </w:tc>
+      </w:tr>
+      <w:tr>
+        <w:tc>
+          <w:tcPr>
+            <w:tcW w:type="dxa" w:w="4200"/>
+            <w:tcMar>
+              <w:top w:type="dxa" w:w="80"/>
+              <w:left w:type="dxa" w:w="115"/>
+              <w:bottom w:type="dxa" w:w="80"/>
+              <w:right w:type="dxa" w:w="115"/>
+            </w:tcMar>
+          </w:tcPr>
+          <w:p>
+            <w:pPr>
+              <w:spacing w:after="0" w:line="252"/>
+            </w:pPr>
+            <w:r>
+              <w:rPr>
+                <w:rFonts w:ascii="Calibri" w:cs="Calibri" w:eastAsia="Calibri" w:hAnsi="Calibri"/>
+                <w:color w:val="1A1A1A"/>
+                <w:sz w:val="18"/>
+                <w:szCs w:val="18"/>
+              </w:rPr>
+              <w:t xml:space="preserve">Every model had its axis sensitivity established before its result was read</w:t>
+            </w:r>
+          </w:p>
+        </w:tc>
+        <w:tc>
+          <w:tcPr>
+            <w:tcW w:type="dxa" w:w="4820"/>
+            <w:tcMar>
+              <w:top w:type="dxa" w:w="80"/>
+              <w:left w:type="dxa" w:w="115"/>
+              <w:bottom w:type="dxa" w:w="80"/>
+              <w:right w:type="dxa" w:w="115"/>
+            </w:tcMar>
+          </w:tcPr>
+          <w:p>
+            <w:pPr>
+              <w:spacing w:after="0" w:line="252"/>
+            </w:pPr>
+            <w:r>
+              <w:rPr>
+                <w:rFonts w:ascii="Calibri" w:cs="Calibri" w:eastAsia="Calibri" w:hAnsi="Calibri"/>
+                <w:color w:val="1A1A1A"/>
+                <w:sz w:val="18"/>
+                <w:szCs w:val="18"/>
+              </w:rPr>
+              <w:t xml:space="preserve">That the pattern generalises past consumer credit — the insurance transfer is Week 10</w:t>
+            </w:r>
+          </w:p>
+        </w:tc>
+      </w:tr>
+    </w:tbl>
+    <w:p>
+      <w:r>
+        <w:br w:type="page"/>
       </w:r>
     </w:p>
     <w:p>
@@ -12377,7 +13949,7 @@
         <w:tc>
           <w:tcPr>
             <w:tcW w:type="dxa" w:w="1500"/>
-            <w:shd w:fill="FBF4E8" w:color="auto" w:val="clear"/>
+            <w:shd w:fill="EDF5EF" w:color="auto" w:val="clear"/>
             <w:tcMar>
               <w:top w:type="dxa" w:w="80"/>
               <w:left w:type="dxa" w:w="115"/>
@@ -12394,11 +13966,11 @@
                 <w:rFonts w:ascii="Calibri" w:cs="Calibri" w:eastAsia="Calibri" w:hAnsi="Calibri"/>
                 <w:b/>
                 <w:bCs/>
-                <w:color w:val="8A5A00"/>
-                <w:sz w:val="18"/>
-                <w:szCs w:val="18"/>
-              </w:rPr>
-              <w:t xml:space="preserve">Started</w:t>
+                <w:color w:val="1E6B34"/>
+                <w:sz w:val="18"/>
+                <w:szCs w:val="18"/>
+              </w:rPr>
+              <w:t xml:space="preserve">EXCEEDED</w:t>
             </w:r>
           </w:p>
         </w:tc>
@@ -12423,7 +13995,7 @@
                 <w:sz w:val="18"/>
                 <w:szCs w:val="18"/>
               </w:rPr>
-              <w:t xml:space="preserve">1 of 2 run, measured and banked; the second is blocked on server stability, not on method</w:t>
+              <w:t xml:space="preserve">Four models across two families and a 10x parameter range, all scored by the same frozen pipeline</w:t>
             </w:r>
           </w:p>
         </w:tc>
@@ -12561,7 +14133,7 @@
           <w:sz w:val="17"/>
           <w:szCs w:val="17"/>
         </w:rPr>
-        <w:t xml:space="preserve">204 tests passing  ·  14,825 responses banked on GitHub  ·  probe set e0d72184  ·  checklist fb4c3454  ·  German Credit 1000 records (CC BY 4.0)</w:t>
+        <w:t xml:space="preserve">210 tests passing  ·  61,259 responses over 4 models  ·  probe set e0d72184  ·  checklist fb4c3454  ·  German Credit 1000 records (CC BY 4.0)</w:t>
       </w:r>
     </w:p>
     <w:sectPr>

</xml_diff>